<commit_message>
Agrego teoría para estudiar para el parcial en los tps de comunicaciones
</commit_message>
<xml_diff>
--- a/4to Año/Comunicaciones II/TP3.docx
+++ b/4to Año/Comunicaciones II/TP3.docx
@@ -2,6 +2,667 @@
 <file path=word/document.xml><?xml version="1.0" encoding="utf-8"?>
 <w:document xmlns:wpc="http://schemas.microsoft.com/office/word/2010/wordprocessingCanvas" xmlns:cx="http://schemas.microsoft.com/office/drawing/2014/chartex" xmlns:cx1="http://schemas.microsoft.com/office/drawing/2015/9/8/chartex" xmlns:cx2="http://schemas.microsoft.com/office/drawing/2015/10/21/chartex" xmlns:cx3="http://schemas.microsoft.com/office/drawing/2016/5/9/chartex" xmlns:cx4="http://schemas.microsoft.com/office/drawing/2016/5/10/chartex" xmlns:cx5="http://schemas.microsoft.com/office/drawing/2016/5/11/chartex" xmlns:cx6="http://schemas.microsoft.com/office/drawing/2016/5/12/chartex" xmlns:cx7="http://schemas.microsoft.com/office/drawing/2016/5/13/chartex" xmlns:cx8="http://schemas.microsoft.com/office/drawing/2016/5/14/chartex" xmlns:mc="http://schemas.openxmlformats.org/markup-compatibility/2006" xmlns:aink="http://schemas.microsoft.com/office/drawing/2016/ink" xmlns:am3d="http://schemas.microsoft.com/office/drawing/2017/model3d" xmlns:o="urn:schemas-microsoft-com:office:office" xmlns:r="http://schemas.openxmlformats.org/officeDocument/2006/relationships" xmlns:m="http://schemas.openxmlformats.org/officeDocument/2006/math" xmlns:v="urn:schemas-microsoft-com:vml" xmlns:wp14="http://schemas.microsoft.com/office/word/2010/wordprocessingDrawing" xmlns:wp="http://schemas.openxmlformats.org/drawingml/2006/wordprocessingDrawing" xmlns:w10="urn:schemas-microsoft-com:office:word" xmlns:w="http://schemas.openxmlformats.org/wordprocessingml/2006/main" xmlns:w14="http://schemas.microsoft.com/office/word/2010/wordml" xmlns:w15="http://schemas.microsoft.com/office/word/2012/wordml" xmlns:w16cex="http://schemas.microsoft.com/office/word/2018/wordml/cex" xmlns:w16cid="http://schemas.microsoft.com/office/word/2016/wordml/cid" xmlns:w16="http://schemas.microsoft.com/office/word/2018/wordml" xmlns:w16sdtdh="http://schemas.microsoft.com/office/word/2020/wordml/sdtdatahash" xmlns:w16se="http://schemas.microsoft.com/office/word/2015/wordml/symex" xmlns:wpg="http://schemas.microsoft.com/office/word/2010/wordprocessingGroup" xmlns:wpi="http://schemas.microsoft.com/office/word/2010/wordprocessingInk" xmlns:wne="http://schemas.microsoft.com/office/word/2006/wordml" xmlns:wps="http://schemas.microsoft.com/office/word/2010/wordprocessingShape" mc:Ignorable="w14 w15 w16se w16cid w16 w16cex w16sdtdh wp14">
   <w:body>
+    <w:p>
+      <w:pPr>
+        <w:pStyle w:val="Sinespaciado"/>
+      </w:pPr>
+    </w:p>
+    <w:p>
+      <w:pPr>
+        <w:pStyle w:val="Subttulo"/>
+        <w:rPr>
+          <w:lang w:val="es-ES"/>
+        </w:rPr>
+      </w:pPr>
+      <w:r>
+        <w:rPr>
+          <w:lang w:val="es-ES"/>
+        </w:rPr>
+        <w:t xml:space="preserve">Concepto de </w:t>
+      </w:r>
+      <w:proofErr w:type="spellStart"/>
+      <w:r>
+        <w:rPr>
+          <w:lang w:val="es-ES"/>
+        </w:rPr>
+        <w:t>Multiplexión</w:t>
+      </w:r>
+      <w:proofErr w:type="spellEnd"/>
+    </w:p>
+    <w:p>
+      <w:r>
+        <w:t>La multiplexación permite que varios pares de dispositivos (A↔B) que se encuentran en diferentes ubicaciones geográficas se comuniquen utilizando un único enlace físico.</w:t>
+      </w:r>
+    </w:p>
+    <w:p>
+      <w:pPr>
+        <w:pStyle w:val="Sinespaciado"/>
+      </w:pPr>
+    </w:p>
+    <w:p>
+      <w:pPr>
+        <w:pStyle w:val="Sinespaciado"/>
+      </w:pPr>
+      <w:r>
+        <w:rPr>
+          <w:noProof/>
+        </w:rPr>
+        <w:drawing>
+          <wp:inline distT="0" distB="0" distL="0" distR="0" wp14:anchorId="62877E69" wp14:editId="0888BB10">
+            <wp:extent cx="6040120" cy="2138841"/>
+            <wp:effectExtent l="0" t="0" r="0" b="0"/>
+            <wp:docPr id="11" name="Imagen 11"/>
+            <wp:cNvGraphicFramePr>
+              <a:graphicFrameLocks xmlns:a="http://schemas.openxmlformats.org/drawingml/2006/main" noChangeAspect="1"/>
+            </wp:cNvGraphicFramePr>
+            <a:graphic xmlns:a="http://schemas.openxmlformats.org/drawingml/2006/main">
+              <a:graphicData uri="http://schemas.openxmlformats.org/drawingml/2006/picture">
+                <pic:pic xmlns:pic="http://schemas.openxmlformats.org/drawingml/2006/picture">
+                  <pic:nvPicPr>
+                    <pic:cNvPr id="1" name=""/>
+                    <pic:cNvPicPr/>
+                  </pic:nvPicPr>
+                  <pic:blipFill>
+                    <a:blip r:embed="rId8"/>
+                    <a:stretch>
+                      <a:fillRect/>
+                    </a:stretch>
+                  </pic:blipFill>
+                  <pic:spPr>
+                    <a:xfrm>
+                      <a:off x="0" y="0"/>
+                      <a:ext cx="6040120" cy="2138841"/>
+                    </a:xfrm>
+                    <a:prstGeom prst="rect">
+                      <a:avLst/>
+                    </a:prstGeom>
+                  </pic:spPr>
+                </pic:pic>
+              </a:graphicData>
+            </a:graphic>
+          </wp:inline>
+        </w:drawing>
+      </w:r>
+    </w:p>
+    <w:p>
+      <w:r>
+        <w:t xml:space="preserve">Cada conexión utiliza solo </w:t>
+      </w:r>
+      <w:r>
+        <w:rPr>
+          <w:b/>
+          <w:bCs/>
+        </w:rPr>
+        <w:t>una fracción de la capacidad total</w:t>
+      </w:r>
+      <w:r>
+        <w:t xml:space="preserve"> del enlace.</w:t>
+      </w:r>
+      <w:r>
+        <w:br/>
+        <w:t>Esto se logra mediante dispositivos llamados:</w:t>
+      </w:r>
+    </w:p>
+    <w:p>
+      <w:pPr>
+        <w:pStyle w:val="Prrafodelista"/>
+        <w:widowControl/>
+        <w:numPr>
+          <w:ilvl w:val="0"/>
+          <w:numId w:val="10"/>
+        </w:numPr>
+        <w:autoSpaceDE/>
+        <w:autoSpaceDN/>
+        <w:spacing w:after="160" w:line="278" w:lineRule="auto"/>
+        <w:contextualSpacing/>
+      </w:pPr>
+      <w:r>
+        <w:rPr>
+          <w:b/>
+          <w:bCs/>
+        </w:rPr>
+        <w:t>MUX (Multiplexor):</w:t>
+      </w:r>
+      <w:r>
+        <w:t xml:space="preserve"> combina las señales de entrada en un solo flujo.</w:t>
+      </w:r>
+    </w:p>
+    <w:p>
+      <w:pPr>
+        <w:pStyle w:val="Prrafodelista"/>
+        <w:widowControl/>
+        <w:numPr>
+          <w:ilvl w:val="0"/>
+          <w:numId w:val="10"/>
+        </w:numPr>
+        <w:autoSpaceDE/>
+        <w:autoSpaceDN/>
+        <w:spacing w:after="160" w:line="278" w:lineRule="auto"/>
+        <w:contextualSpacing/>
+      </w:pPr>
+      <w:r>
+        <w:rPr>
+          <w:b/>
+          <w:bCs/>
+        </w:rPr>
+        <w:t>DEMUX (Demultiplexor):</w:t>
+      </w:r>
+      <w:r>
+        <w:t xml:space="preserve"> separa el flujo en señales originales al llegar al destino.</w:t>
+      </w:r>
+    </w:p>
+    <w:p>
+      <w:pPr>
+        <w:pStyle w:val="Sinespaciado"/>
+        <w:jc w:val="center"/>
+      </w:pPr>
+      <w:r>
+        <w:rPr>
+          <w:noProof/>
+        </w:rPr>
+        <w:drawing>
+          <wp:inline distT="0" distB="0" distL="0" distR="0" wp14:anchorId="3C6F2D3E" wp14:editId="102774F9">
+            <wp:extent cx="4657501" cy="2638425"/>
+            <wp:effectExtent l="0" t="0" r="0" b="0"/>
+            <wp:docPr id="6" name="Imagen 6"/>
+            <wp:cNvGraphicFramePr>
+              <a:graphicFrameLocks xmlns:a="http://schemas.openxmlformats.org/drawingml/2006/main" noChangeAspect="1"/>
+            </wp:cNvGraphicFramePr>
+            <a:graphic xmlns:a="http://schemas.openxmlformats.org/drawingml/2006/main">
+              <a:graphicData uri="http://schemas.openxmlformats.org/drawingml/2006/picture">
+                <pic:pic xmlns:pic="http://schemas.openxmlformats.org/drawingml/2006/picture">
+                  <pic:nvPicPr>
+                    <pic:cNvPr id="1" name=""/>
+                    <pic:cNvPicPr/>
+                  </pic:nvPicPr>
+                  <pic:blipFill>
+                    <a:blip r:embed="rId9"/>
+                    <a:stretch>
+                      <a:fillRect/>
+                    </a:stretch>
+                  </pic:blipFill>
+                  <pic:spPr>
+                    <a:xfrm>
+                      <a:off x="0" y="0"/>
+                      <a:ext cx="4661516" cy="2640700"/>
+                    </a:xfrm>
+                    <a:prstGeom prst="rect">
+                      <a:avLst/>
+                    </a:prstGeom>
+                  </pic:spPr>
+                </pic:pic>
+              </a:graphicData>
+            </a:graphic>
+          </wp:inline>
+        </w:drawing>
+      </w:r>
+    </w:p>
+    <w:p>
+      <w:pPr>
+        <w:pStyle w:val="Sinespaciado"/>
+      </w:pPr>
+    </w:p>
+    <w:p>
+      <w:pPr>
+        <w:pStyle w:val="Subttulo"/>
+        <w:rPr>
+          <w:lang w:val="es-ES"/>
+        </w:rPr>
+      </w:pPr>
+    </w:p>
+    <w:p>
+      <w:pPr>
+        <w:pStyle w:val="Subttulo"/>
+        <w:rPr>
+          <w:lang w:val="es-ES"/>
+        </w:rPr>
+      </w:pPr>
+    </w:p>
+    <w:p>
+      <w:pPr>
+        <w:pStyle w:val="Subttulo"/>
+        <w:rPr>
+          <w:lang w:val="es-ES"/>
+        </w:rPr>
+      </w:pPr>
+    </w:p>
+    <w:p>
+      <w:pPr>
+        <w:pStyle w:val="Subttulo"/>
+        <w:rPr>
+          <w:lang w:val="es-ES"/>
+        </w:rPr>
+      </w:pPr>
+    </w:p>
+    <w:p>
+      <w:pPr>
+        <w:pStyle w:val="Subttulo"/>
+        <w:rPr>
+          <w:lang w:val="es-ES"/>
+        </w:rPr>
+      </w:pPr>
+    </w:p>
+    <w:p>
+      <w:pPr>
+        <w:pStyle w:val="Subttulo"/>
+        <w:rPr>
+          <w:lang w:val="es-ES"/>
+        </w:rPr>
+      </w:pPr>
+    </w:p>
+    <w:p>
+      <w:pPr>
+        <w:pStyle w:val="Subttulo"/>
+        <w:rPr>
+          <w:lang w:val="es-ES"/>
+        </w:rPr>
+      </w:pPr>
+      <w:r>
+        <w:rPr>
+          <w:lang w:val="es-ES"/>
+        </w:rPr>
+        <w:t>Tipos de Multiplexación</w:t>
+      </w:r>
+    </w:p>
+    <w:tbl>
+      <w:tblPr>
+        <w:tblStyle w:val="Tablanormal5"/>
+        <w:tblW w:w="0" w:type="auto"/>
+        <w:tblLook w:val="04A0" w:firstRow="1" w:lastRow="0" w:firstColumn="1" w:lastColumn="0" w:noHBand="0" w:noVBand="1"/>
+      </w:tblPr>
+      <w:tblGrid>
+        <w:gridCol w:w="3268"/>
+        <w:gridCol w:w="2228"/>
+        <w:gridCol w:w="1296"/>
+        <w:gridCol w:w="2720"/>
+      </w:tblGrid>
+      <w:tr>
+        <w:trPr>
+          <w:cnfStyle w:val="100000000000" w:firstRow="1" w:lastRow="0" w:firstColumn="0" w:lastColumn="0" w:oddVBand="0" w:evenVBand="0" w:oddHBand="0" w:evenHBand="0" w:firstRowFirstColumn="0" w:firstRowLastColumn="0" w:lastRowFirstColumn="0" w:lastRowLastColumn="0"/>
+        </w:trPr>
+        <w:tc>
+          <w:tcPr>
+            <w:cnfStyle w:val="001000000100" w:firstRow="0" w:lastRow="0" w:firstColumn="1" w:lastColumn="0" w:oddVBand="0" w:evenVBand="0" w:oddHBand="0" w:evenHBand="0" w:firstRowFirstColumn="1" w:firstRowLastColumn="0" w:lastRowFirstColumn="0" w:lastRowLastColumn="0"/>
+            <w:tcW w:w="0" w:type="auto"/>
+            <w:hideMark/>
+          </w:tcPr>
+          <w:p>
+            <w:pPr>
+              <w:spacing w:after="160" w:line="278" w:lineRule="auto"/>
+              <w:jc w:val="left"/>
+              <w:rPr>
+                <w:b/>
+                <w:bCs/>
+              </w:rPr>
+            </w:pPr>
+            <w:r>
+              <w:rPr>
+                <w:b/>
+                <w:bCs/>
+              </w:rPr>
+              <w:t>Tipo</w:t>
+            </w:r>
+          </w:p>
+        </w:tc>
+        <w:tc>
+          <w:tcPr>
+            <w:tcW w:w="0" w:type="auto"/>
+            <w:hideMark/>
+          </w:tcPr>
+          <w:p>
+            <w:pPr>
+              <w:spacing w:after="160" w:line="278" w:lineRule="auto"/>
+              <w:cnfStyle w:val="100000000000" w:firstRow="1" w:lastRow="0" w:firstColumn="0" w:lastColumn="0" w:oddVBand="0" w:evenVBand="0" w:oddHBand="0" w:evenHBand="0" w:firstRowFirstColumn="0" w:firstRowLastColumn="0" w:lastRowFirstColumn="0" w:lastRowLastColumn="0"/>
+              <w:rPr>
+                <w:b/>
+                <w:bCs/>
+              </w:rPr>
+            </w:pPr>
+            <w:r>
+              <w:rPr>
+                <w:b/>
+                <w:bCs/>
+              </w:rPr>
+              <w:t>Técnica</w:t>
+            </w:r>
+          </w:p>
+        </w:tc>
+        <w:tc>
+          <w:tcPr>
+            <w:tcW w:w="0" w:type="auto"/>
+            <w:hideMark/>
+          </w:tcPr>
+          <w:p>
+            <w:pPr>
+              <w:spacing w:after="160" w:line="278" w:lineRule="auto"/>
+              <w:cnfStyle w:val="100000000000" w:firstRow="1" w:lastRow="0" w:firstColumn="0" w:lastColumn="0" w:oddVBand="0" w:evenVBand="0" w:oddHBand="0" w:evenHBand="0" w:firstRowFirstColumn="0" w:firstRowLastColumn="0" w:lastRowFirstColumn="0" w:lastRowLastColumn="0"/>
+              <w:rPr>
+                <w:b/>
+                <w:bCs/>
+              </w:rPr>
+            </w:pPr>
+            <w:r>
+              <w:rPr>
+                <w:b/>
+                <w:bCs/>
+              </w:rPr>
+              <w:t>Señales</w:t>
+            </w:r>
+          </w:p>
+        </w:tc>
+        <w:tc>
+          <w:tcPr>
+            <w:tcW w:w="0" w:type="auto"/>
+            <w:hideMark/>
+          </w:tcPr>
+          <w:p>
+            <w:pPr>
+              <w:spacing w:after="160" w:line="278" w:lineRule="auto"/>
+              <w:cnfStyle w:val="100000000000" w:firstRow="1" w:lastRow="0" w:firstColumn="0" w:lastColumn="0" w:oddVBand="0" w:evenVBand="0" w:oddHBand="0" w:evenHBand="0" w:firstRowFirstColumn="0" w:firstRowLastColumn="0" w:lastRowFirstColumn="0" w:lastRowLastColumn="0"/>
+              <w:rPr>
+                <w:b/>
+                <w:bCs/>
+              </w:rPr>
+            </w:pPr>
+            <w:r>
+              <w:rPr>
+                <w:b/>
+                <w:bCs/>
+              </w:rPr>
+              <w:t>Ejemplo de uso</w:t>
+            </w:r>
+          </w:p>
+        </w:tc>
+      </w:tr>
+      <w:tr>
+        <w:trPr>
+          <w:cnfStyle w:val="000000100000" w:firstRow="0" w:lastRow="0" w:firstColumn="0" w:lastColumn="0" w:oddVBand="0" w:evenVBand="0" w:oddHBand="1" w:evenHBand="0" w:firstRowFirstColumn="0" w:firstRowLastColumn="0" w:lastRowFirstColumn="0" w:lastRowLastColumn="0"/>
+        </w:trPr>
+        <w:tc>
+          <w:tcPr>
+            <w:cnfStyle w:val="001000000000" w:firstRow="0" w:lastRow="0" w:firstColumn="1" w:lastColumn="0" w:oddVBand="0" w:evenVBand="0" w:oddHBand="0" w:evenHBand="0" w:firstRowFirstColumn="0" w:firstRowLastColumn="0" w:lastRowFirstColumn="0" w:lastRowLastColumn="0"/>
+            <w:tcW w:w="0" w:type="auto"/>
+            <w:hideMark/>
+          </w:tcPr>
+          <w:p>
+            <w:pPr>
+              <w:spacing w:after="160" w:line="278" w:lineRule="auto"/>
+            </w:pPr>
+            <w:r>
+              <w:rPr>
+                <w:b/>
+                <w:bCs/>
+              </w:rPr>
+              <w:t>FDM</w:t>
+            </w:r>
+            <w:r>
+              <w:t xml:space="preserve"> (</w:t>
+            </w:r>
+            <w:proofErr w:type="spellStart"/>
+            <w:r>
+              <w:t>Frequency</w:t>
+            </w:r>
+            <w:proofErr w:type="spellEnd"/>
+            <w:r>
+              <w:t xml:space="preserve"> </w:t>
+            </w:r>
+            <w:proofErr w:type="spellStart"/>
+            <w:r>
+              <w:t>Division</w:t>
+            </w:r>
+            <w:proofErr w:type="spellEnd"/>
+            <w:r>
+              <w:t xml:space="preserve"> </w:t>
+            </w:r>
+            <w:proofErr w:type="spellStart"/>
+            <w:r>
+              <w:t>Multiplexing</w:t>
+            </w:r>
+            <w:proofErr w:type="spellEnd"/>
+            <w:r>
+              <w:t>)</w:t>
+            </w:r>
+          </w:p>
+        </w:tc>
+        <w:tc>
+          <w:tcPr>
+            <w:tcW w:w="0" w:type="auto"/>
+            <w:hideMark/>
+          </w:tcPr>
+          <w:p>
+            <w:pPr>
+              <w:spacing w:after="160" w:line="278" w:lineRule="auto"/>
+              <w:cnfStyle w:val="000000100000" w:firstRow="0" w:lastRow="0" w:firstColumn="0" w:lastColumn="0" w:oddVBand="0" w:evenVBand="0" w:oddHBand="1" w:evenHBand="0" w:firstRowFirstColumn="0" w:firstRowLastColumn="0" w:lastRowFirstColumn="0" w:lastRowLastColumn="0"/>
+            </w:pPr>
+            <w:r>
+              <w:t>División en frecuencias</w:t>
+            </w:r>
+          </w:p>
+        </w:tc>
+        <w:tc>
+          <w:tcPr>
+            <w:tcW w:w="0" w:type="auto"/>
+            <w:hideMark/>
+          </w:tcPr>
+          <w:p>
+            <w:pPr>
+              <w:spacing w:after="160" w:line="278" w:lineRule="auto"/>
+              <w:cnfStyle w:val="000000100000" w:firstRow="0" w:lastRow="0" w:firstColumn="0" w:lastColumn="0" w:oddVBand="0" w:evenVBand="0" w:oddHBand="1" w:evenHBand="0" w:firstRowFirstColumn="0" w:firstRowLastColumn="0" w:lastRowFirstColumn="0" w:lastRowLastColumn="0"/>
+            </w:pPr>
+            <w:r>
+              <w:t>Analógicas</w:t>
+            </w:r>
+          </w:p>
+        </w:tc>
+        <w:tc>
+          <w:tcPr>
+            <w:tcW w:w="0" w:type="auto"/>
+            <w:hideMark/>
+          </w:tcPr>
+          <w:p>
+            <w:pPr>
+              <w:spacing w:after="160" w:line="278" w:lineRule="auto"/>
+              <w:cnfStyle w:val="000000100000" w:firstRow="0" w:lastRow="0" w:firstColumn="0" w:lastColumn="0" w:oddVBand="0" w:evenVBand="0" w:oddHBand="1" w:evenHBand="0" w:firstRowFirstColumn="0" w:firstRowLastColumn="0" w:lastRowFirstColumn="0" w:lastRowLastColumn="0"/>
+              <w:rPr>
+                <w:lang w:val="en-US"/>
+              </w:rPr>
+            </w:pPr>
+            <w:r>
+              <w:rPr>
+                <w:lang w:val="en-US"/>
+              </w:rPr>
+              <w:t>Radio, TV por cable, ADSL</w:t>
+            </w:r>
+          </w:p>
+        </w:tc>
+      </w:tr>
+      <w:tr>
+        <w:tc>
+          <w:tcPr>
+            <w:cnfStyle w:val="001000000000" w:firstRow="0" w:lastRow="0" w:firstColumn="1" w:lastColumn="0" w:oddVBand="0" w:evenVBand="0" w:oddHBand="0" w:evenHBand="0" w:firstRowFirstColumn="0" w:firstRowLastColumn="0" w:lastRowFirstColumn="0" w:lastRowLastColumn="0"/>
+            <w:tcW w:w="0" w:type="auto"/>
+            <w:hideMark/>
+          </w:tcPr>
+          <w:p>
+            <w:pPr>
+              <w:spacing w:after="160" w:line="278" w:lineRule="auto"/>
+            </w:pPr>
+            <w:r>
+              <w:rPr>
+                <w:b/>
+                <w:bCs/>
+              </w:rPr>
+              <w:t>TDM</w:t>
+            </w:r>
+            <w:r>
+              <w:t xml:space="preserve"> (Time </w:t>
+            </w:r>
+            <w:proofErr w:type="spellStart"/>
+            <w:r>
+              <w:t>Division</w:t>
+            </w:r>
+            <w:proofErr w:type="spellEnd"/>
+            <w:r>
+              <w:t xml:space="preserve"> </w:t>
+            </w:r>
+            <w:proofErr w:type="spellStart"/>
+            <w:r>
+              <w:t>Multiplexing</w:t>
+            </w:r>
+            <w:proofErr w:type="spellEnd"/>
+            <w:r>
+              <w:t>)</w:t>
+            </w:r>
+          </w:p>
+        </w:tc>
+        <w:tc>
+          <w:tcPr>
+            <w:tcW w:w="0" w:type="auto"/>
+            <w:hideMark/>
+          </w:tcPr>
+          <w:p>
+            <w:pPr>
+              <w:spacing w:after="160" w:line="278" w:lineRule="auto"/>
+              <w:cnfStyle w:val="000000000000" w:firstRow="0" w:lastRow="0" w:firstColumn="0" w:lastColumn="0" w:oddVBand="0" w:evenVBand="0" w:oddHBand="0" w:evenHBand="0" w:firstRowFirstColumn="0" w:firstRowLastColumn="0" w:lastRowFirstColumn="0" w:lastRowLastColumn="0"/>
+            </w:pPr>
+            <w:r>
+              <w:t>División en tiempo</w:t>
+            </w:r>
+          </w:p>
+        </w:tc>
+        <w:tc>
+          <w:tcPr>
+            <w:tcW w:w="0" w:type="auto"/>
+            <w:hideMark/>
+          </w:tcPr>
+          <w:p>
+            <w:pPr>
+              <w:spacing w:after="160" w:line="278" w:lineRule="auto"/>
+              <w:cnfStyle w:val="000000000000" w:firstRow="0" w:lastRow="0" w:firstColumn="0" w:lastColumn="0" w:oddVBand="0" w:evenVBand="0" w:oddHBand="0" w:evenHBand="0" w:firstRowFirstColumn="0" w:firstRowLastColumn="0" w:lastRowFirstColumn="0" w:lastRowLastColumn="0"/>
+            </w:pPr>
+            <w:r>
+              <w:t>Digitales</w:t>
+            </w:r>
+          </w:p>
+        </w:tc>
+        <w:tc>
+          <w:tcPr>
+            <w:tcW w:w="0" w:type="auto"/>
+            <w:hideMark/>
+          </w:tcPr>
+          <w:p>
+            <w:pPr>
+              <w:spacing w:after="160" w:line="278" w:lineRule="auto"/>
+              <w:cnfStyle w:val="000000000000" w:firstRow="0" w:lastRow="0" w:firstColumn="0" w:lastColumn="0" w:oddVBand="0" w:evenVBand="0" w:oddHBand="0" w:evenHBand="0" w:firstRowFirstColumn="0" w:firstRowLastColumn="0" w:lastRowFirstColumn="0" w:lastRowLastColumn="0"/>
+            </w:pPr>
+            <w:r>
+              <w:t>Telefonía digital, transmisión de datos</w:t>
+            </w:r>
+          </w:p>
+        </w:tc>
+      </w:tr>
+      <w:tr>
+        <w:trPr>
+          <w:cnfStyle w:val="000000100000" w:firstRow="0" w:lastRow="0" w:firstColumn="0" w:lastColumn="0" w:oddVBand="0" w:evenVBand="0" w:oddHBand="1" w:evenHBand="0" w:firstRowFirstColumn="0" w:firstRowLastColumn="0" w:lastRowFirstColumn="0" w:lastRowLastColumn="0"/>
+        </w:trPr>
+        <w:tc>
+          <w:tcPr>
+            <w:cnfStyle w:val="001000000000" w:firstRow="0" w:lastRow="0" w:firstColumn="1" w:lastColumn="0" w:oddVBand="0" w:evenVBand="0" w:oddHBand="0" w:evenHBand="0" w:firstRowFirstColumn="0" w:firstRowLastColumn="0" w:lastRowFirstColumn="0" w:lastRowLastColumn="0"/>
+            <w:tcW w:w="0" w:type="auto"/>
+            <w:hideMark/>
+          </w:tcPr>
+          <w:p>
+            <w:pPr>
+              <w:spacing w:after="160" w:line="278" w:lineRule="auto"/>
+            </w:pPr>
+            <w:r>
+              <w:rPr>
+                <w:b/>
+                <w:bCs/>
+              </w:rPr>
+              <w:t>WDM</w:t>
+            </w:r>
+            <w:r>
+              <w:t xml:space="preserve"> (</w:t>
+            </w:r>
+            <w:proofErr w:type="spellStart"/>
+            <w:r>
+              <w:t>Wavelength</w:t>
+            </w:r>
+            <w:proofErr w:type="spellEnd"/>
+            <w:r>
+              <w:t xml:space="preserve"> </w:t>
+            </w:r>
+            <w:proofErr w:type="spellStart"/>
+            <w:r>
+              <w:t>Division</w:t>
+            </w:r>
+            <w:proofErr w:type="spellEnd"/>
+            <w:r>
+              <w:t xml:space="preserve"> </w:t>
+            </w:r>
+            <w:proofErr w:type="spellStart"/>
+            <w:r>
+              <w:t>Multiplexing</w:t>
+            </w:r>
+            <w:proofErr w:type="spellEnd"/>
+            <w:r>
+              <w:t>)</w:t>
+            </w:r>
+          </w:p>
+        </w:tc>
+        <w:tc>
+          <w:tcPr>
+            <w:tcW w:w="0" w:type="auto"/>
+            <w:hideMark/>
+          </w:tcPr>
+          <w:p>
+            <w:pPr>
+              <w:spacing w:after="160" w:line="278" w:lineRule="auto"/>
+              <w:cnfStyle w:val="000000100000" w:firstRow="0" w:lastRow="0" w:firstColumn="0" w:lastColumn="0" w:oddVBand="0" w:evenVBand="0" w:oddHBand="1" w:evenHBand="0" w:firstRowFirstColumn="0" w:firstRowLastColumn="0" w:lastRowFirstColumn="0" w:lastRowLastColumn="0"/>
+            </w:pPr>
+            <w:r>
+              <w:t>División en longitud de onda</w:t>
+            </w:r>
+          </w:p>
+        </w:tc>
+        <w:tc>
+          <w:tcPr>
+            <w:tcW w:w="0" w:type="auto"/>
+            <w:hideMark/>
+          </w:tcPr>
+          <w:p>
+            <w:pPr>
+              <w:spacing w:after="160" w:line="278" w:lineRule="auto"/>
+              <w:cnfStyle w:val="000000100000" w:firstRow="0" w:lastRow="0" w:firstColumn="0" w:lastColumn="0" w:oddVBand="0" w:evenVBand="0" w:oddHBand="1" w:evenHBand="0" w:firstRowFirstColumn="0" w:firstRowLastColumn="0" w:lastRowFirstColumn="0" w:lastRowLastColumn="0"/>
+            </w:pPr>
+            <w:r>
+              <w:t>Ópticas</w:t>
+            </w:r>
+          </w:p>
+        </w:tc>
+        <w:tc>
+          <w:tcPr>
+            <w:tcW w:w="0" w:type="auto"/>
+            <w:hideMark/>
+          </w:tcPr>
+          <w:p>
+            <w:pPr>
+              <w:spacing w:after="160" w:line="278" w:lineRule="auto"/>
+              <w:cnfStyle w:val="000000100000" w:firstRow="0" w:lastRow="0" w:firstColumn="0" w:lastColumn="0" w:oddVBand="0" w:evenVBand="0" w:oddHBand="1" w:evenHBand="0" w:firstRowFirstColumn="0" w:firstRowLastColumn="0" w:lastRowFirstColumn="0" w:lastRowLastColumn="0"/>
+            </w:pPr>
+            <w:r>
+              <w:t>Redes de fibra óptica</w:t>
+            </w:r>
+          </w:p>
+        </w:tc>
+      </w:tr>
+    </w:tbl>
+    <w:p>
+      <w:pPr>
+        <w:pStyle w:val="Sinespaciado"/>
+      </w:pPr>
+    </w:p>
     <w:p>
       <w:pPr>
         <w:pStyle w:val="Sinespaciado"/>
@@ -183,46 +844,305 @@
     <w:p>
       <w:pPr>
         <w:pStyle w:val="Prrafodelista"/>
-        <w:numPr>
-          <w:ilvl w:val="1"/>
-          <w:numId w:val="2"/>
-        </w:numPr>
         <w:tabs>
           <w:tab w:val="left" w:pos="994"/>
         </w:tabs>
-        <w:spacing w:before="17"/>
-        <w:ind w:left="994" w:hanging="404"/>
-      </w:pPr>
-      <w:r>
-        <w:rPr>
-          <w:spacing w:val="-5"/>
-        </w:rPr>
-        <w:t>FDM</w:t>
-      </w:r>
-    </w:p>
-    <w:p>
-      <w:pPr>
-        <w:pStyle w:val="Prrafodelista"/>
-        <w:tabs>
-          <w:tab w:val="left" w:pos="994"/>
-        </w:tabs>
-        <w:spacing w:before="17"/>
+        <w:spacing w:before="9"/>
         <w:ind w:firstLine="0"/>
         <w:jc w:val="both"/>
       </w:pPr>
-      <w:r>
-        <w:t>L</w:t>
-      </w:r>
-      <w:r>
-        <w:t xml:space="preserve">a </w:t>
-      </w:r>
-      <w:proofErr w:type="spellStart"/>
-      <w:r>
-        <w:t>multiplexión</w:t>
-      </w:r>
-      <w:proofErr w:type="spellEnd"/>
-      <w:r>
-        <w:t xml:space="preserve"> por división en frecuencia (FDM) consiste en asignar distintas bandas de frecuencia a cada señal dentro de un mismo medio. Cada canal se transmite modulando una portadora diferente y se separa de los demás mediante bandas de guarda, evitando interferencias. Un ejemplo claro es la televisión por cable o la radio FM, donde cada emisora ocupa un rango de frecuencias dentro del espectro. FDM permite transmitir simultáneamente señales analógicas y digitales, pero sufre de un uso poco eficiente del espectro y de posibles problemas de diafonía.</w:t>
+    </w:p>
+    <w:p>
+      <w:pPr>
+        <w:ind w:left="994"/>
+      </w:pPr>
+      <w:r>
+        <w:t>Se usa TDM cuando la velocidad de transmisión alcanzable por el medio es mayor que la suma de las velocidades de las señales digitales</w:t>
+      </w:r>
+      <w:r>
+        <w:t>.</w:t>
+      </w:r>
+    </w:p>
+    <w:p>
+      <w:pPr>
+        <w:pStyle w:val="Prrafodelista"/>
+        <w:tabs>
+          <w:tab w:val="left" w:pos="994"/>
+        </w:tabs>
+        <w:spacing w:before="9"/>
+        <w:ind w:firstLine="0"/>
+        <w:jc w:val="both"/>
+      </w:pPr>
+    </w:p>
+    <w:p>
+      <w:pPr>
+        <w:ind w:left="994"/>
+        <w:rPr>
+          <w:rStyle w:val="nfasissutil"/>
+          <w:u w:val="single"/>
+        </w:rPr>
+      </w:pPr>
+      <w:r>
+        <w:rPr>
+          <w:rStyle w:val="nfasissutil"/>
+          <w:u w:val="single"/>
+        </w:rPr>
+        <w:t>Funcionamiento</w:t>
+      </w:r>
+    </w:p>
+    <w:p>
+      <w:pPr>
+        <w:ind w:left="994"/>
+        <w:jc w:val="center"/>
+        <w:rPr>
+          <w:rStyle w:val="nfasissutil"/>
+          <w:u w:val="single"/>
+        </w:rPr>
+      </w:pPr>
+      <w:r>
+        <w:rPr>
+          <w:rStyle w:val="nfasissutil"/>
+          <w:noProof/>
+          <w:u w:val="single"/>
+        </w:rPr>
+        <w:drawing>
+          <wp:inline distT="0" distB="0" distL="0" distR="0" wp14:anchorId="4CD81300" wp14:editId="185DC736">
+            <wp:extent cx="5268060" cy="1505160"/>
+            <wp:effectExtent l="0" t="0" r="8890" b="0"/>
+            <wp:docPr id="12" name="Imagen 12"/>
+            <wp:cNvGraphicFramePr>
+              <a:graphicFrameLocks xmlns:a="http://schemas.openxmlformats.org/drawingml/2006/main" noChangeAspect="1"/>
+            </wp:cNvGraphicFramePr>
+            <a:graphic xmlns:a="http://schemas.openxmlformats.org/drawingml/2006/main">
+              <a:graphicData uri="http://schemas.openxmlformats.org/drawingml/2006/picture">
+                <pic:pic xmlns:pic="http://schemas.openxmlformats.org/drawingml/2006/picture">
+                  <pic:nvPicPr>
+                    <pic:cNvPr id="1" name=""/>
+                    <pic:cNvPicPr/>
+                  </pic:nvPicPr>
+                  <pic:blipFill>
+                    <a:blip r:embed="rId10"/>
+                    <a:stretch>
+                      <a:fillRect/>
+                    </a:stretch>
+                  </pic:blipFill>
+                  <pic:spPr>
+                    <a:xfrm>
+                      <a:off x="0" y="0"/>
+                      <a:ext cx="5268060" cy="1505160"/>
+                    </a:xfrm>
+                    <a:prstGeom prst="rect">
+                      <a:avLst/>
+                    </a:prstGeom>
+                  </pic:spPr>
+                </pic:pic>
+              </a:graphicData>
+            </a:graphic>
+          </wp:inline>
+        </w:drawing>
+      </w:r>
+    </w:p>
+    <w:p>
+      <w:pPr>
+        <w:pStyle w:val="Prrafodelista"/>
+        <w:widowControl/>
+        <w:numPr>
+          <w:ilvl w:val="0"/>
+          <w:numId w:val="13"/>
+        </w:numPr>
+        <w:autoSpaceDE/>
+        <w:autoSpaceDN/>
+        <w:spacing w:after="160" w:line="278" w:lineRule="auto"/>
+        <w:ind w:left="1714"/>
+        <w:contextualSpacing/>
+      </w:pPr>
+      <w:r>
+        <w:t xml:space="preserve">El </w:t>
+      </w:r>
+      <w:r>
+        <w:rPr>
+          <w:b/>
+          <w:bCs/>
+        </w:rPr>
+        <w:t>MUX</w:t>
+      </w:r>
+      <w:r>
+        <w:t xml:space="preserve"> toma datos de cada entrada, los almacena temporalmente en </w:t>
+      </w:r>
+      <w:r>
+        <w:rPr>
+          <w:b/>
+          <w:bCs/>
+        </w:rPr>
+        <w:t>buffers</w:t>
+      </w:r>
+      <w:r>
+        <w:t xml:space="preserve"> y los organiza en </w:t>
+      </w:r>
+      <w:r>
+        <w:rPr>
+          <w:b/>
+          <w:bCs/>
+        </w:rPr>
+        <w:t>tramas</w:t>
+      </w:r>
+      <w:r>
+        <w:t>.</w:t>
+      </w:r>
+    </w:p>
+    <w:p>
+      <w:pPr>
+        <w:pStyle w:val="Prrafodelista"/>
+        <w:widowControl/>
+        <w:numPr>
+          <w:ilvl w:val="0"/>
+          <w:numId w:val="13"/>
+        </w:numPr>
+        <w:autoSpaceDE/>
+        <w:autoSpaceDN/>
+        <w:spacing w:after="160" w:line="278" w:lineRule="auto"/>
+        <w:ind w:left="1714"/>
+        <w:contextualSpacing/>
+      </w:pPr>
+      <w:r>
+        <w:t xml:space="preserve">Cada trama tiene varias </w:t>
+      </w:r>
+      <w:r>
+        <w:rPr>
+          <w:b/>
+          <w:bCs/>
+        </w:rPr>
+        <w:t>ranuras temporales (time slots)</w:t>
+      </w:r>
+      <w:r>
+        <w:t>, asignadas a cada fuente.</w:t>
+      </w:r>
+    </w:p>
+    <w:p>
+      <w:pPr>
+        <w:pStyle w:val="Prrafodelista"/>
+        <w:ind w:left="1988"/>
+        <w:jc w:val="center"/>
+      </w:pPr>
+      <w:r>
+        <w:rPr>
+          <w:noProof/>
+        </w:rPr>
+        <w:lastRenderedPageBreak/>
+        <w:drawing>
+          <wp:inline distT="0" distB="0" distL="0" distR="0" wp14:anchorId="60B01EC8" wp14:editId="5F99D963">
+            <wp:extent cx="4267796" cy="2638793"/>
+            <wp:effectExtent l="0" t="0" r="1270" b="0"/>
+            <wp:docPr id="13" name="Imagen 13"/>
+            <wp:cNvGraphicFramePr>
+              <a:graphicFrameLocks xmlns:a="http://schemas.openxmlformats.org/drawingml/2006/main" noChangeAspect="1"/>
+            </wp:cNvGraphicFramePr>
+            <a:graphic xmlns:a="http://schemas.openxmlformats.org/drawingml/2006/main">
+              <a:graphicData uri="http://schemas.openxmlformats.org/drawingml/2006/picture">
+                <pic:pic xmlns:pic="http://schemas.openxmlformats.org/drawingml/2006/picture">
+                  <pic:nvPicPr>
+                    <pic:cNvPr id="1" name=""/>
+                    <pic:cNvPicPr/>
+                  </pic:nvPicPr>
+                  <pic:blipFill>
+                    <a:blip r:embed="rId11"/>
+                    <a:stretch>
+                      <a:fillRect/>
+                    </a:stretch>
+                  </pic:blipFill>
+                  <pic:spPr>
+                    <a:xfrm>
+                      <a:off x="0" y="0"/>
+                      <a:ext cx="4267796" cy="2638793"/>
+                    </a:xfrm>
+                    <a:prstGeom prst="rect">
+                      <a:avLst/>
+                    </a:prstGeom>
+                  </pic:spPr>
+                </pic:pic>
+              </a:graphicData>
+            </a:graphic>
+          </wp:inline>
+        </w:drawing>
+      </w:r>
+    </w:p>
+    <w:p>
+      <w:pPr>
+        <w:pStyle w:val="Prrafodelista"/>
+        <w:widowControl/>
+        <w:numPr>
+          <w:ilvl w:val="0"/>
+          <w:numId w:val="13"/>
+        </w:numPr>
+        <w:autoSpaceDE/>
+        <w:autoSpaceDN/>
+        <w:spacing w:after="160" w:line="278" w:lineRule="auto"/>
+        <w:ind w:left="1714"/>
+        <w:contextualSpacing/>
+      </w:pPr>
+      <w:r>
+        <w:t xml:space="preserve">El </w:t>
+      </w:r>
+      <w:r>
+        <w:rPr>
+          <w:b/>
+          <w:bCs/>
+        </w:rPr>
+        <w:t>DEMUX</w:t>
+      </w:r>
+      <w:r>
+        <w:t xml:space="preserve"> separa los datos en el receptor, siguiendo la misma sincronización.</w:t>
+      </w:r>
+    </w:p>
+    <w:p>
+      <w:pPr>
+        <w:pStyle w:val="Prrafodelista"/>
+        <w:tabs>
+          <w:tab w:val="left" w:pos="994"/>
+        </w:tabs>
+        <w:spacing w:before="9"/>
+        <w:ind w:left="1988" w:firstLine="0"/>
+        <w:jc w:val="both"/>
+      </w:pPr>
+      <w:r>
+        <w:rPr>
+          <w:noProof/>
+        </w:rPr>
+        <w:drawing>
+          <wp:inline distT="0" distB="0" distL="0" distR="0" wp14:anchorId="2C359909" wp14:editId="1F3CC198">
+            <wp:extent cx="4845844" cy="1762125"/>
+            <wp:effectExtent l="0" t="0" r="0" b="0"/>
+            <wp:docPr id="14" name="Imagen 14"/>
+            <wp:cNvGraphicFramePr>
+              <a:graphicFrameLocks xmlns:a="http://schemas.openxmlformats.org/drawingml/2006/main" noChangeAspect="1"/>
+            </wp:cNvGraphicFramePr>
+            <a:graphic xmlns:a="http://schemas.openxmlformats.org/drawingml/2006/main">
+              <a:graphicData uri="http://schemas.openxmlformats.org/drawingml/2006/picture">
+                <pic:pic xmlns:pic="http://schemas.openxmlformats.org/drawingml/2006/picture">
+                  <pic:nvPicPr>
+                    <pic:cNvPr id="1" name=""/>
+                    <pic:cNvPicPr/>
+                  </pic:nvPicPr>
+                  <pic:blipFill>
+                    <a:blip r:embed="rId12"/>
+                    <a:stretch>
+                      <a:fillRect/>
+                    </a:stretch>
+                  </pic:blipFill>
+                  <pic:spPr>
+                    <a:xfrm>
+                      <a:off x="0" y="0"/>
+                      <a:ext cx="4860489" cy="1767451"/>
+                    </a:xfrm>
+                    <a:prstGeom prst="rect">
+                      <a:avLst/>
+                    </a:prstGeom>
+                  </pic:spPr>
+                </pic:pic>
+              </a:graphicData>
+            </a:graphic>
+          </wp:inline>
+        </w:drawing>
       </w:r>
     </w:p>
     <w:p>
@@ -240,10 +1160,20 @@
       </w:pPr>
       <w:r>
         <w:rPr>
-          <w:spacing w:val="-4"/>
-        </w:rPr>
-        <w:t>STDM</w:t>
-      </w:r>
+          <w:spacing w:val="-5"/>
+        </w:rPr>
+        <w:t>FDM</w:t>
+      </w:r>
+    </w:p>
+    <w:p>
+      <w:pPr>
+        <w:pStyle w:val="Prrafodelista"/>
+        <w:tabs>
+          <w:tab w:val="left" w:pos="994"/>
+        </w:tabs>
+        <w:spacing w:before="17"/>
+        <w:ind w:firstLine="0"/>
+      </w:pPr>
     </w:p>
     <w:p>
       <w:pPr>
@@ -267,14 +1197,449 @@
       </w:r>
       <w:proofErr w:type="spellEnd"/>
       <w:r>
-        <w:t xml:space="preserve"> estadística por división en el tiempo (STDM)</w:t>
-      </w:r>
-      <w:r>
-        <w:t xml:space="preserve"> es una variante de TDM</w:t>
-      </w:r>
-      <w:r>
-        <w:t>. A diferencia del TDM tradicional, las ranuras no se asignan de forma fija, sino dinámica, según la demanda de transmisión. Esto evita que se envíen ranuras vacías, incrementando la eficiencia. Sin embargo, para lograrlo, cada ranura debe incluir información adicional que identifique la fuente o el destino de los datos, lo que introduce sobrecarga y mayor complejidad. STDM es muy útil en redes de datos, donde la mayoría de los dispositivos no transmiten continuamente.</w:t>
-      </w:r>
+        <w:t xml:space="preserve"> por división en frecuencia (FDM) consiste en asignar distintas bandas de frecuencia a cada señal dentro de un mismo medio. Cada canal se transmite modulando una portadora diferente y se separa de los demás mediante bandas de guarda, evitando interferencias. Un ejemplo claro es la televisión por cable o la radio FM, donde cada emisora ocupa un rango de frecuencias dentro del espectro. FDM permite transmitir simultáneamente señales analógicas y digitales, pero sufre de un uso poco eficiente del espectro y de posibles problemas de diafonía.</w:t>
+      </w:r>
+    </w:p>
+    <w:p>
+      <w:pPr>
+        <w:pStyle w:val="Prrafodelista"/>
+        <w:tabs>
+          <w:tab w:val="left" w:pos="994"/>
+        </w:tabs>
+        <w:spacing w:before="17"/>
+        <w:ind w:firstLine="0"/>
+        <w:jc w:val="both"/>
+      </w:pPr>
+    </w:p>
+    <w:p>
+      <w:pPr>
+        <w:pStyle w:val="Prrafodelista"/>
+        <w:tabs>
+          <w:tab w:val="left" w:pos="994"/>
+        </w:tabs>
+        <w:spacing w:before="17"/>
+        <w:ind w:firstLine="0"/>
+        <w:jc w:val="both"/>
+      </w:pPr>
+      <w:r>
+        <w:t>Se usa FDM cuando el ancho de banda útil del medio de transmisión es mayor que la suma de los anchos de banda de las señales que se desean transmitir</w:t>
+      </w:r>
+      <w:r>
+        <w:t>.</w:t>
+      </w:r>
+    </w:p>
+    <w:p>
+      <w:pPr>
+        <w:pStyle w:val="Prrafodelista"/>
+        <w:tabs>
+          <w:tab w:val="left" w:pos="994"/>
+        </w:tabs>
+        <w:spacing w:before="17"/>
+        <w:ind w:firstLine="0"/>
+        <w:jc w:val="both"/>
+      </w:pPr>
+    </w:p>
+    <w:p>
+      <w:pPr>
+        <w:ind w:left="994"/>
+        <w:rPr>
+          <w:rStyle w:val="nfasissutil"/>
+          <w:u w:val="single"/>
+        </w:rPr>
+      </w:pPr>
+      <w:r>
+        <w:rPr>
+          <w:rStyle w:val="nfasissutil"/>
+          <w:u w:val="single"/>
+        </w:rPr>
+        <w:t>Funcionamiento</w:t>
+      </w:r>
+    </w:p>
+    <w:p>
+      <w:pPr>
+        <w:pStyle w:val="Prrafodelista"/>
+        <w:widowControl/>
+        <w:numPr>
+          <w:ilvl w:val="0"/>
+          <w:numId w:val="11"/>
+        </w:numPr>
+        <w:autoSpaceDE/>
+        <w:autoSpaceDN/>
+        <w:spacing w:after="160" w:line="278" w:lineRule="auto"/>
+        <w:ind w:left="1714"/>
+        <w:contextualSpacing/>
+      </w:pPr>
+      <w:r>
+        <w:t xml:space="preserve">Cada señal </w:t>
+      </w:r>
+      <m:oMath>
+        <m:sSub>
+          <m:sSubPr>
+            <m:ctrlPr>
+              <w:rPr>
+                <w:rFonts w:ascii="Cambria Math" w:hAnsi="Cambria Math"/>
+                <w:i/>
+              </w:rPr>
+            </m:ctrlPr>
+          </m:sSubPr>
+          <m:e>
+            <m:r>
+              <w:rPr>
+                <w:rFonts w:ascii="Cambria Math" w:hAnsi="Cambria Math"/>
+              </w:rPr>
+              <m:t>m</m:t>
+            </m:r>
+          </m:e>
+          <m:sub>
+            <m:r>
+              <w:rPr>
+                <w:rFonts w:ascii="Cambria Math" w:hAnsi="Cambria Math"/>
+              </w:rPr>
+              <m:t>i</m:t>
+            </m:r>
+          </m:sub>
+        </m:sSub>
+        <m:r>
+          <w:rPr>
+            <w:rFonts w:ascii="Cambria Math" w:hAnsi="Cambria Math"/>
+          </w:rPr>
+          <m:t>(t)</m:t>
+        </m:r>
+      </m:oMath>
+      <w:r>
+        <w:t xml:space="preserve"> </w:t>
+      </w:r>
+      <w:r>
+        <w:rPr>
+          <w:b/>
+          <w:bCs/>
+        </w:rPr>
+        <w:t>modula una subportadora</w:t>
+      </w:r>
+      <w:r>
+        <w:t xml:space="preserve"> </w:t>
+      </w:r>
+      <m:oMath>
+        <m:sSub>
+          <m:sSubPr>
+            <m:ctrlPr>
+              <w:rPr>
+                <w:rFonts w:ascii="Cambria Math" w:hAnsi="Cambria Math"/>
+                <w:i/>
+              </w:rPr>
+            </m:ctrlPr>
+          </m:sSubPr>
+          <m:e>
+            <m:r>
+              <w:rPr>
+                <w:rFonts w:ascii="Cambria Math" w:hAnsi="Cambria Math"/>
+              </w:rPr>
+              <m:t>f</m:t>
+            </m:r>
+          </m:e>
+          <m:sub>
+            <m:r>
+              <w:rPr>
+                <w:rFonts w:ascii="Cambria Math" w:hAnsi="Cambria Math"/>
+              </w:rPr>
+              <m:t>i</m:t>
+            </m:r>
+          </m:sub>
+        </m:sSub>
+      </m:oMath>
+    </w:p>
+    <w:p>
+      <w:pPr>
+        <w:pStyle w:val="Prrafodelista"/>
+        <w:widowControl/>
+        <w:numPr>
+          <w:ilvl w:val="0"/>
+          <w:numId w:val="11"/>
+        </w:numPr>
+        <w:autoSpaceDE/>
+        <w:autoSpaceDN/>
+        <w:spacing w:after="160" w:line="278" w:lineRule="auto"/>
+        <w:ind w:left="1714"/>
+        <w:contextualSpacing/>
+      </w:pPr>
+      <w:r>
+        <w:t xml:space="preserve">Las señales moduladas se </w:t>
+      </w:r>
+      <w:r>
+        <w:rPr>
+          <w:b/>
+          <w:bCs/>
+        </w:rPr>
+        <w:t>suman</w:t>
+      </w:r>
+      <w:r>
+        <w:t xml:space="preserve"> para formar una </w:t>
+      </w:r>
+      <w:r>
+        <w:rPr>
+          <w:b/>
+          <w:bCs/>
+        </w:rPr>
+        <w:t>señal compuesta</w:t>
+      </w:r>
+      <w:r>
+        <w:t xml:space="preserve"> llamada </w:t>
+      </w:r>
+      <w:r>
+        <w:rPr>
+          <w:b/>
+          <w:bCs/>
+        </w:rPr>
+        <w:t>señal FDM en banda base</w:t>
+      </w:r>
+      <w:r>
+        <w:t>.</w:t>
+      </w:r>
+    </w:p>
+    <w:p>
+      <w:pPr>
+        <w:pStyle w:val="Prrafodelista"/>
+        <w:widowControl/>
+        <w:numPr>
+          <w:ilvl w:val="0"/>
+          <w:numId w:val="11"/>
+        </w:numPr>
+        <w:autoSpaceDE/>
+        <w:autoSpaceDN/>
+        <w:spacing w:after="160" w:line="278" w:lineRule="auto"/>
+        <w:ind w:left="1714"/>
+        <w:contextualSpacing/>
+      </w:pPr>
+      <w:r>
+        <w:t xml:space="preserve">Esa señal compuesta se </w:t>
+      </w:r>
+      <w:r>
+        <w:rPr>
+          <w:b/>
+          <w:bCs/>
+        </w:rPr>
+        <w:t>modula nuevamente</w:t>
+      </w:r>
+      <w:r>
+        <w:t>, si es necesario, para adecuarse al medio físico.</w:t>
+      </w:r>
+    </w:p>
+    <w:p>
+      <w:pPr>
+        <w:widowControl/>
+        <w:autoSpaceDE/>
+        <w:autoSpaceDN/>
+        <w:spacing w:after="160" w:line="278" w:lineRule="auto"/>
+        <w:ind w:left="1354"/>
+        <w:contextualSpacing/>
+      </w:pPr>
+      <w:r>
+        <w:rPr>
+          <w:rStyle w:val="nfasissutil"/>
+          <w:i w:val="0"/>
+          <w:iCs w:val="0"/>
+          <w:noProof/>
+        </w:rPr>
+        <w:lastRenderedPageBreak/>
+        <w:drawing>
+          <wp:inline distT="0" distB="0" distL="0" distR="0" wp14:anchorId="7C3B9C5E" wp14:editId="15EAC0C8">
+            <wp:extent cx="4601217" cy="3315163"/>
+            <wp:effectExtent l="0" t="0" r="0" b="0"/>
+            <wp:docPr id="7" name="Imagen 7"/>
+            <wp:cNvGraphicFramePr>
+              <a:graphicFrameLocks xmlns:a="http://schemas.openxmlformats.org/drawingml/2006/main" noChangeAspect="1"/>
+            </wp:cNvGraphicFramePr>
+            <a:graphic xmlns:a="http://schemas.openxmlformats.org/drawingml/2006/main">
+              <a:graphicData uri="http://schemas.openxmlformats.org/drawingml/2006/picture">
+                <pic:pic xmlns:pic="http://schemas.openxmlformats.org/drawingml/2006/picture">
+                  <pic:nvPicPr>
+                    <pic:cNvPr id="1" name=""/>
+                    <pic:cNvPicPr/>
+                  </pic:nvPicPr>
+                  <pic:blipFill>
+                    <a:blip r:embed="rId13"/>
+                    <a:stretch>
+                      <a:fillRect/>
+                    </a:stretch>
+                  </pic:blipFill>
+                  <pic:spPr>
+                    <a:xfrm>
+                      <a:off x="0" y="0"/>
+                      <a:ext cx="4601217" cy="3315163"/>
+                    </a:xfrm>
+                    <a:prstGeom prst="rect">
+                      <a:avLst/>
+                    </a:prstGeom>
+                  </pic:spPr>
+                </pic:pic>
+              </a:graphicData>
+            </a:graphic>
+          </wp:inline>
+        </w:drawing>
+      </w:r>
+    </w:p>
+    <w:p>
+      <w:pPr>
+        <w:pStyle w:val="Prrafodelista"/>
+        <w:widowControl/>
+        <w:numPr>
+          <w:ilvl w:val="0"/>
+          <w:numId w:val="11"/>
+        </w:numPr>
+        <w:autoSpaceDE/>
+        <w:autoSpaceDN/>
+        <w:spacing w:after="160" w:line="278" w:lineRule="auto"/>
+        <w:contextualSpacing/>
+      </w:pPr>
+      <w:r>
+        <w:t xml:space="preserve">En el receptor, el </w:t>
+      </w:r>
+      <w:r>
+        <w:rPr>
+          <w:b/>
+          <w:bCs/>
+        </w:rPr>
+        <w:t>DEMUX</w:t>
+      </w:r>
+      <w:r>
+        <w:t xml:space="preserve"> separa las señales usando </w:t>
+      </w:r>
+      <w:r>
+        <w:rPr>
+          <w:b/>
+          <w:bCs/>
+        </w:rPr>
+        <w:t xml:space="preserve">filtros </w:t>
+      </w:r>
+      <w:proofErr w:type="spellStart"/>
+      <w:r>
+        <w:rPr>
+          <w:b/>
+          <w:bCs/>
+        </w:rPr>
+        <w:t>pasabanda</w:t>
+      </w:r>
+      <w:proofErr w:type="spellEnd"/>
+      <w:r>
+        <w:t xml:space="preserve"> y luego las </w:t>
+      </w:r>
+      <w:r>
+        <w:rPr>
+          <w:b/>
+          <w:bCs/>
+        </w:rPr>
+        <w:t>demodula</w:t>
+      </w:r>
+      <w:r>
+        <w:t>.</w:t>
+      </w:r>
+    </w:p>
+    <w:p>
+      <w:pPr>
+        <w:pStyle w:val="Prrafodelista"/>
+        <w:widowControl/>
+        <w:autoSpaceDE/>
+        <w:autoSpaceDN/>
+        <w:spacing w:after="160" w:line="278" w:lineRule="auto"/>
+        <w:ind w:firstLine="0"/>
+        <w:contextualSpacing/>
+      </w:pPr>
+      <w:r>
+        <w:rPr>
+          <w:rStyle w:val="nfasissutil"/>
+          <w:i w:val="0"/>
+          <w:iCs w:val="0"/>
+          <w:noProof/>
+        </w:rPr>
+        <w:drawing>
+          <wp:inline distT="0" distB="0" distL="0" distR="0" wp14:anchorId="01FE0826" wp14:editId="098B432B">
+            <wp:extent cx="5448299" cy="2976547"/>
+            <wp:effectExtent l="0" t="0" r="635" b="0"/>
+            <wp:docPr id="9" name="Imagen 9"/>
+            <wp:cNvGraphicFramePr>
+              <a:graphicFrameLocks xmlns:a="http://schemas.openxmlformats.org/drawingml/2006/main" noChangeAspect="1"/>
+            </wp:cNvGraphicFramePr>
+            <a:graphic xmlns:a="http://schemas.openxmlformats.org/drawingml/2006/main">
+              <a:graphicData uri="http://schemas.openxmlformats.org/drawingml/2006/picture">
+                <pic:pic xmlns:pic="http://schemas.openxmlformats.org/drawingml/2006/picture">
+                  <pic:nvPicPr>
+                    <pic:cNvPr id="1" name=""/>
+                    <pic:cNvPicPr/>
+                  </pic:nvPicPr>
+                  <pic:blipFill>
+                    <a:blip r:embed="rId14"/>
+                    <a:stretch>
+                      <a:fillRect/>
+                    </a:stretch>
+                  </pic:blipFill>
+                  <pic:spPr>
+                    <a:xfrm>
+                      <a:off x="0" y="0"/>
+                      <a:ext cx="5454238" cy="2979791"/>
+                    </a:xfrm>
+                    <a:prstGeom prst="rect">
+                      <a:avLst/>
+                    </a:prstGeom>
+                  </pic:spPr>
+                </pic:pic>
+              </a:graphicData>
+            </a:graphic>
+          </wp:inline>
+        </w:drawing>
+      </w:r>
+    </w:p>
+    <w:p>
+      <w:pPr>
+        <w:pStyle w:val="Prrafodelista"/>
+        <w:widowControl/>
+        <w:autoSpaceDE/>
+        <w:autoSpaceDN/>
+        <w:spacing w:after="160" w:line="278" w:lineRule="auto"/>
+        <w:ind w:firstLine="0"/>
+        <w:contextualSpacing/>
+      </w:pPr>
+    </w:p>
+    <w:p>
+      <w:pPr>
+        <w:pStyle w:val="Prrafodelista"/>
+        <w:widowControl/>
+        <w:autoSpaceDE/>
+        <w:autoSpaceDN/>
+        <w:spacing w:after="160" w:line="278" w:lineRule="auto"/>
+        <w:ind w:firstLine="0"/>
+        <w:contextualSpacing/>
+      </w:pPr>
+    </w:p>
+    <w:p>
+      <w:pPr>
+        <w:widowControl/>
+        <w:autoSpaceDE/>
+        <w:autoSpaceDN/>
+        <w:spacing w:after="160" w:line="278" w:lineRule="auto"/>
+        <w:contextualSpacing/>
+      </w:pPr>
+    </w:p>
+    <w:p>
+      <w:pPr>
+        <w:pStyle w:val="Prrafodelista"/>
+        <w:tabs>
+          <w:tab w:val="left" w:pos="994"/>
+        </w:tabs>
+        <w:spacing w:before="17"/>
+        <w:ind w:firstLine="0"/>
+        <w:jc w:val="both"/>
+      </w:pPr>
+    </w:p>
+    <w:p>
+      <w:pPr>
+        <w:pStyle w:val="Prrafodelista"/>
+        <w:tabs>
+          <w:tab w:val="left" w:pos="994"/>
+        </w:tabs>
+        <w:spacing w:before="17"/>
+        <w:ind w:firstLine="0"/>
+        <w:jc w:val="both"/>
+      </w:pPr>
     </w:p>
     <w:p>
       <w:pPr>
@@ -291,10 +1656,20 @@
       </w:pPr>
       <w:r>
         <w:rPr>
-          <w:spacing w:val="-5"/>
-        </w:rPr>
-        <w:t>WDM</w:t>
-      </w:r>
+          <w:spacing w:val="-4"/>
+        </w:rPr>
+        <w:t>STDM</w:t>
+      </w:r>
+    </w:p>
+    <w:p>
+      <w:pPr>
+        <w:pStyle w:val="Prrafodelista"/>
+        <w:tabs>
+          <w:tab w:val="left" w:pos="994"/>
+        </w:tabs>
+        <w:spacing w:before="17"/>
+        <w:ind w:firstLine="0"/>
+      </w:pPr>
     </w:p>
     <w:p>
       <w:pPr>
@@ -318,20 +1693,511 @@
       </w:r>
       <w:proofErr w:type="spellEnd"/>
       <w:r>
-        <w:t xml:space="preserve"> por división en longitudes de onda (WDM)</w:t>
-      </w:r>
-      <w:r>
-        <w:t xml:space="preserve"> es una</w:t>
-      </w:r>
-      <w:r>
-        <w:t xml:space="preserve"> técnica</w:t>
-      </w:r>
-      <w:r>
-        <w:t xml:space="preserve"> que</w:t>
-      </w:r>
-      <w:r>
-        <w:t xml:space="preserve"> aprovecha que un solo hilo de fibra puede transportar simultáneamente múltiples haces de luz, cada uno en una longitud de onda distinta. Cada canal óptico corresponde a un color de luz diferente, generado mediante un láser, y todos son combinados por un multiplexor para viajar juntos en la misma fibra. En el extremo receptor, un demultiplexor separa los haces. Esta técnica permite aprovechar al máximo la capacidad de la fibra sin necesidad de tender más enlaces, aunque requiere equipos láser precisos y costosos.</w:t>
-      </w:r>
+        <w:t xml:space="preserve"> estadística por división en el tiempo (STDM)</w:t>
+      </w:r>
+      <w:r>
+        <w:t xml:space="preserve"> es una variante de TDM</w:t>
+      </w:r>
+      <w:r>
+        <w:t xml:space="preserve">. A diferencia del TDM tradicional, las ranuras no se asignan de forma fija, sino dinámica, según la </w:t>
+      </w:r>
+      <w:r>
+        <w:lastRenderedPageBreak/>
+        <w:t>demanda de transmisión. Esto evita que se envíen ranuras vacías, incrementando la eficiencia. Sin embargo, para lograrlo, cada ranura debe incluir información adicional que identifique la fuente o el destino de los datos, lo que introduce sobrecarga y mayor complejidad. STDM es muy útil en redes de datos, donde la mayoría de los dispositivos no transmiten continuamente.</w:t>
+      </w:r>
+    </w:p>
+    <w:p>
+      <w:pPr>
+        <w:pStyle w:val="Prrafodelista"/>
+        <w:tabs>
+          <w:tab w:val="left" w:pos="994"/>
+        </w:tabs>
+        <w:spacing w:before="17"/>
+        <w:ind w:firstLine="0"/>
+        <w:jc w:val="both"/>
+      </w:pPr>
+    </w:p>
+    <w:p>
+      <w:pPr>
+        <w:ind w:left="994"/>
+        <w:rPr>
+          <w:rStyle w:val="nfasissutil"/>
+          <w:u w:val="single"/>
+        </w:rPr>
+      </w:pPr>
+      <w:r>
+        <w:rPr>
+          <w:rStyle w:val="nfasissutil"/>
+          <w:u w:val="single"/>
+        </w:rPr>
+        <w:t>Arquitectura y funcionamiento interno</w:t>
+      </w:r>
+    </w:p>
+    <w:p>
+      <w:pPr>
+        <w:pStyle w:val="Prrafodelista"/>
+        <w:widowControl/>
+        <w:numPr>
+          <w:ilvl w:val="0"/>
+          <w:numId w:val="14"/>
+        </w:numPr>
+        <w:autoSpaceDE/>
+        <w:autoSpaceDN/>
+        <w:spacing w:after="160" w:line="278" w:lineRule="auto"/>
+        <w:ind w:left="1714"/>
+        <w:contextualSpacing/>
+      </w:pPr>
+      <w:r>
+        <w:rPr>
+          <w:b/>
+          <w:bCs/>
+        </w:rPr>
+        <w:t>Entradas y buffers</w:t>
+      </w:r>
+      <w:r>
+        <w:t xml:space="preserve">: cada línea de entrada al MUX tiene una </w:t>
+      </w:r>
+      <w:r>
+        <w:rPr>
+          <w:b/>
+          <w:bCs/>
+        </w:rPr>
+        <w:t>memoria temporal (buffer)</w:t>
+      </w:r>
+      <w:r>
+        <w:t xml:space="preserve"> donde se acopia la información que llega de esa fuente. El MUX lee esos buffers para componer la trama.</w:t>
+      </w:r>
+    </w:p>
+    <w:p>
+      <w:pPr>
+        <w:pStyle w:val="Prrafodelista"/>
+        <w:widowControl/>
+        <w:numPr>
+          <w:ilvl w:val="0"/>
+          <w:numId w:val="14"/>
+        </w:numPr>
+        <w:autoSpaceDE/>
+        <w:autoSpaceDN/>
+        <w:spacing w:after="160" w:line="278" w:lineRule="auto"/>
+        <w:ind w:left="1714"/>
+        <w:contextualSpacing/>
+      </w:pPr>
+      <w:r>
+        <w:rPr>
+          <w:b/>
+          <w:bCs/>
+        </w:rPr>
+        <w:t>Ranuras disponibles por trama</w:t>
+      </w:r>
+      <w:r>
+        <w:t>: hay n fuentes, pero solo k ranuras por trama (con k &lt; n). El MUX llena la trama con las ranuras de las fuentes activas hasta completar k ranuras o hasta quedarse sin datos.</w:t>
+      </w:r>
+    </w:p>
+    <w:p>
+      <w:pPr>
+        <w:pStyle w:val="Prrafodelista"/>
+        <w:widowControl/>
+        <w:numPr>
+          <w:ilvl w:val="0"/>
+          <w:numId w:val="14"/>
+        </w:numPr>
+        <w:autoSpaceDE/>
+        <w:autoSpaceDN/>
+        <w:spacing w:after="160" w:line="278" w:lineRule="auto"/>
+        <w:ind w:left="1714"/>
+        <w:contextualSpacing/>
+      </w:pPr>
+      <w:r>
+        <w:rPr>
+          <w:b/>
+          <w:bCs/>
+        </w:rPr>
+        <w:t>Pérdida del significado posicional</w:t>
+      </w:r>
+      <w:r>
+        <w:t xml:space="preserve">: como las fuentes no ocupan siempre la misma ranura, </w:t>
+      </w:r>
+      <w:r>
+        <w:rPr>
+          <w:b/>
+          <w:bCs/>
+        </w:rPr>
+        <w:t>cada ranura debe llevar información de direccionamiento</w:t>
+      </w:r>
+      <w:r>
+        <w:t xml:space="preserve"> (ID de flujo / dirección / etiqueta) para que el DEMUX pueda reenviar los datos al buffer de salida correcto.</w:t>
+      </w:r>
+    </w:p>
+    <w:p>
+      <w:pPr>
+        <w:pStyle w:val="Prrafodelista"/>
+        <w:widowControl/>
+        <w:numPr>
+          <w:ilvl w:val="0"/>
+          <w:numId w:val="14"/>
+        </w:numPr>
+        <w:autoSpaceDE/>
+        <w:autoSpaceDN/>
+        <w:spacing w:after="160" w:line="278" w:lineRule="auto"/>
+        <w:ind w:left="1714"/>
+        <w:contextualSpacing/>
+      </w:pPr>
+      <w:r>
+        <w:rPr>
+          <w:b/>
+          <w:bCs/>
+        </w:rPr>
+        <w:t xml:space="preserve">Envío y </w:t>
+      </w:r>
+      <w:proofErr w:type="spellStart"/>
+      <w:r>
+        <w:rPr>
+          <w:b/>
+          <w:bCs/>
+        </w:rPr>
+        <w:t>demultiplexado</w:t>
+      </w:r>
+      <w:proofErr w:type="spellEnd"/>
+      <w:r>
+        <w:t>: la trama (con sus campos de datos + etiquetas/longitudes) viaja; el receptor distribuye cada subcampo al buffer de salida correspondiente según la dirección/etiqueta.</w:t>
+      </w:r>
+    </w:p>
+    <w:p>
+      <w:pPr>
+        <w:ind w:left="1354"/>
+        <w:jc w:val="center"/>
+        <w:rPr>
+          <w:rStyle w:val="nfasissutil"/>
+          <w:i w:val="0"/>
+          <w:iCs w:val="0"/>
+        </w:rPr>
+      </w:pPr>
+      <w:r>
+        <w:rPr>
+          <w:rStyle w:val="nfasissutil"/>
+          <w:i w:val="0"/>
+          <w:iCs w:val="0"/>
+          <w:noProof/>
+        </w:rPr>
+        <w:drawing>
+          <wp:inline distT="0" distB="0" distL="0" distR="0" wp14:anchorId="49808320" wp14:editId="6233486A">
+            <wp:extent cx="5382376" cy="3267531"/>
+            <wp:effectExtent l="0" t="0" r="8890" b="9525"/>
+            <wp:docPr id="15" name="Imagen 15"/>
+            <wp:cNvGraphicFramePr>
+              <a:graphicFrameLocks xmlns:a="http://schemas.openxmlformats.org/drawingml/2006/main" noChangeAspect="1"/>
+            </wp:cNvGraphicFramePr>
+            <a:graphic xmlns:a="http://schemas.openxmlformats.org/drawingml/2006/main">
+              <a:graphicData uri="http://schemas.openxmlformats.org/drawingml/2006/picture">
+                <pic:pic xmlns:pic="http://schemas.openxmlformats.org/drawingml/2006/picture">
+                  <pic:nvPicPr>
+                    <pic:cNvPr id="1" name=""/>
+                    <pic:cNvPicPr/>
+                  </pic:nvPicPr>
+                  <pic:blipFill>
+                    <a:blip r:embed="rId15"/>
+                    <a:stretch>
+                      <a:fillRect/>
+                    </a:stretch>
+                  </pic:blipFill>
+                  <pic:spPr>
+                    <a:xfrm>
+                      <a:off x="0" y="0"/>
+                      <a:ext cx="5382376" cy="3267531"/>
+                    </a:xfrm>
+                    <a:prstGeom prst="rect">
+                      <a:avLst/>
+                    </a:prstGeom>
+                  </pic:spPr>
+                </pic:pic>
+              </a:graphicData>
+            </a:graphic>
+          </wp:inline>
+        </w:drawing>
+      </w:r>
+    </w:p>
+    <w:p>
+      <w:pPr>
+        <w:ind w:left="994"/>
+        <w:rPr>
+          <w:i/>
+          <w:iCs/>
+          <w:color w:val="404040" w:themeColor="text1" w:themeTint="BF"/>
+          <w:u w:val="single"/>
+        </w:rPr>
+      </w:pPr>
+      <w:r>
+        <w:rPr>
+          <w:i/>
+          <w:iCs/>
+          <w:color w:val="404040" w:themeColor="text1" w:themeTint="BF"/>
+          <w:u w:val="single"/>
+        </w:rPr>
+        <w:t>Parámetros clave y fórmulas</w:t>
+      </w:r>
+    </w:p>
+    <w:p>
+      <w:pPr>
+        <w:pStyle w:val="Prrafodelista"/>
+        <w:widowControl/>
+        <w:numPr>
+          <w:ilvl w:val="0"/>
+          <w:numId w:val="15"/>
+        </w:numPr>
+        <w:autoSpaceDE/>
+        <w:autoSpaceDN/>
+        <w:spacing w:after="160" w:line="278" w:lineRule="auto"/>
+        <w:ind w:left="1714"/>
+        <w:contextualSpacing/>
+      </w:pPr>
+      <w:r>
+        <w:t>I = número de fuentes de entrada.</w:t>
+      </w:r>
+    </w:p>
+    <w:p>
+      <w:pPr>
+        <w:pStyle w:val="Prrafodelista"/>
+        <w:widowControl/>
+        <w:numPr>
+          <w:ilvl w:val="0"/>
+          <w:numId w:val="15"/>
+        </w:numPr>
+        <w:autoSpaceDE/>
+        <w:autoSpaceDN/>
+        <w:spacing w:after="160" w:line="278" w:lineRule="auto"/>
+        <w:ind w:left="1714"/>
+        <w:contextualSpacing/>
+      </w:pPr>
+      <w:r>
+        <w:t>R = velocidad máxima por fuente (bps).</w:t>
+      </w:r>
+    </w:p>
+    <w:p>
+      <w:pPr>
+        <w:pStyle w:val="Prrafodelista"/>
+        <w:widowControl/>
+        <w:numPr>
+          <w:ilvl w:val="0"/>
+          <w:numId w:val="15"/>
+        </w:numPr>
+        <w:autoSpaceDE/>
+        <w:autoSpaceDN/>
+        <w:spacing w:after="160" w:line="278" w:lineRule="auto"/>
+        <w:ind w:left="1714"/>
+        <w:contextualSpacing/>
+      </w:pPr>
+      <w:r>
+        <w:t xml:space="preserve">M = capacidad efectiva de la línea de salida (bps), </w:t>
+      </w:r>
+      <w:r>
+        <w:rPr>
+          <w:b/>
+          <w:bCs/>
+        </w:rPr>
+        <w:t>incluye</w:t>
+      </w:r>
+      <w:r>
+        <w:t xml:space="preserve"> que se suman bits suplementarios/</w:t>
+      </w:r>
+      <w:proofErr w:type="spellStart"/>
+      <w:r>
+        <w:t>overhead</w:t>
+      </w:r>
+      <w:proofErr w:type="spellEnd"/>
+      <w:r>
+        <w:t xml:space="preserve"> del MUX.</w:t>
+      </w:r>
+    </w:p>
+    <w:p>
+      <w:pPr>
+        <w:pStyle w:val="Prrafodelista"/>
+        <w:widowControl/>
+        <w:numPr>
+          <w:ilvl w:val="0"/>
+          <w:numId w:val="15"/>
+        </w:numPr>
+        <w:autoSpaceDE/>
+        <w:autoSpaceDN/>
+        <w:spacing w:after="160" w:line="278" w:lineRule="auto"/>
+        <w:ind w:left="1714"/>
+        <w:contextualSpacing/>
+      </w:pPr>
+      <w:r>
+        <w:t xml:space="preserve">α = fracción media de tiempo que, en promedio, transmiten </w:t>
+      </w:r>
+      <w:r>
+        <w:rPr>
+          <w:b/>
+          <w:bCs/>
+        </w:rPr>
+        <w:t>las fuentes</w:t>
+      </w:r>
+      <w:r>
+        <w:t xml:space="preserve"> (0 &lt; α &lt; 1).</w:t>
+      </w:r>
+    </w:p>
+    <w:p>
+      <w:pPr>
+        <w:pStyle w:val="Prrafodelista"/>
+        <w:widowControl/>
+        <w:numPr>
+          <w:ilvl w:val="0"/>
+          <w:numId w:val="15"/>
+        </w:numPr>
+        <w:autoSpaceDE/>
+        <w:autoSpaceDN/>
+        <w:spacing w:after="160" w:line="278" w:lineRule="auto"/>
+        <w:ind w:left="1714"/>
+        <w:contextualSpacing/>
+      </w:pPr>
+      <w:r>
+        <w:t xml:space="preserve">K = M / (I * R) (proporción entre capacidad de salida y la entrada máxima total). </w:t>
+      </w:r>
+    </w:p>
+    <w:p>
+      <w:pPr>
+        <w:pStyle w:val="Prrafodelista"/>
+        <w:ind w:left="1988"/>
+        <w:rPr>
+          <w:rStyle w:val="nfasissutil"/>
+          <w:i w:val="0"/>
+          <w:iCs w:val="0"/>
+        </w:rPr>
+      </w:pPr>
+      <w:r>
+        <w:t>En TDM sincrónico K = 1.</w:t>
+      </w:r>
+    </w:p>
+    <w:p>
+      <w:pPr>
+        <w:ind w:left="994"/>
+        <w:rPr>
+          <w:rStyle w:val="nfasissutil"/>
+          <w:i w:val="0"/>
+          <w:iCs w:val="0"/>
+        </w:rPr>
+      </w:pPr>
+      <w:r>
+        <w:rPr>
+          <w:rStyle w:val="nfasissutil"/>
+        </w:rPr>
+        <w:t>Condiciones importantes:</w:t>
+      </w:r>
+    </w:p>
+    <w:p>
+      <w:pPr>
+        <w:pStyle w:val="Prrafodelista"/>
+        <w:widowControl/>
+        <w:numPr>
+          <w:ilvl w:val="0"/>
+          <w:numId w:val="16"/>
+        </w:numPr>
+        <w:autoSpaceDE/>
+        <w:autoSpaceDN/>
+        <w:spacing w:after="160" w:line="278" w:lineRule="auto"/>
+        <w:ind w:left="1714"/>
+        <w:contextualSpacing/>
+      </w:pPr>
+      <w:r>
+        <w:lastRenderedPageBreak/>
+        <w:t xml:space="preserve">Para operar razonablemente: </w:t>
+      </w:r>
+      <w:r>
+        <w:rPr>
+          <w:b/>
+          <w:bCs/>
+        </w:rPr>
+        <w:t>α &lt; K &lt; 1</w:t>
+      </w:r>
+      <w:r>
+        <w:t>.</w:t>
+      </w:r>
+    </w:p>
+    <w:p>
+      <w:pPr>
+        <w:pStyle w:val="Prrafodelista"/>
+        <w:widowControl/>
+        <w:numPr>
+          <w:ilvl w:val="0"/>
+          <w:numId w:val="17"/>
+        </w:numPr>
+        <w:autoSpaceDE/>
+        <w:autoSpaceDN/>
+        <w:spacing w:after="160" w:line="278" w:lineRule="auto"/>
+        <w:ind w:left="2434"/>
+        <w:contextualSpacing/>
+      </w:pPr>
+      <w:r>
+        <w:t>Si K = 1 → es TDM sincrónico (capacidad igual a suma máxima).</w:t>
+      </w:r>
+    </w:p>
+    <w:p>
+      <w:pPr>
+        <w:pStyle w:val="Prrafodelista"/>
+        <w:widowControl/>
+        <w:numPr>
+          <w:ilvl w:val="0"/>
+          <w:numId w:val="17"/>
+        </w:numPr>
+        <w:autoSpaceDE/>
+        <w:autoSpaceDN/>
+        <w:spacing w:after="160" w:line="278" w:lineRule="auto"/>
+        <w:ind w:left="2434"/>
+        <w:contextualSpacing/>
+      </w:pPr>
+      <w:r>
+        <w:t>Si K = α → la línea soporta en promedio la entrada; con memoria finita las ráfagas se absorben, pero hay límites.</w:t>
+      </w:r>
+    </w:p>
+    <w:p>
+      <w:pPr>
+        <w:pStyle w:val="Prrafodelista"/>
+        <w:widowControl/>
+        <w:numPr>
+          <w:ilvl w:val="0"/>
+          <w:numId w:val="17"/>
+        </w:numPr>
+        <w:autoSpaceDE/>
+        <w:autoSpaceDN/>
+        <w:spacing w:after="160" w:line="278" w:lineRule="auto"/>
+        <w:ind w:left="2434"/>
+        <w:contextualSpacing/>
+      </w:pPr>
+      <w:r>
+        <w:t xml:space="preserve">Si K &lt; α → la entrada promedio excede la salida → </w:t>
+      </w:r>
+      <w:r>
+        <w:rPr>
+          <w:b/>
+          <w:bCs/>
+        </w:rPr>
+        <w:t>rebalse inevitable</w:t>
+      </w:r>
+      <w:r>
+        <w:t>.</w:t>
+      </w:r>
+    </w:p>
+    <w:p>
+      <w:pPr>
+        <w:pStyle w:val="Prrafodelista"/>
+        <w:tabs>
+          <w:tab w:val="left" w:pos="994"/>
+        </w:tabs>
+        <w:spacing w:before="17"/>
+        <w:ind w:firstLine="0"/>
+        <w:jc w:val="both"/>
+      </w:pPr>
+    </w:p>
+    <w:p>
+      <w:pPr>
+        <w:pStyle w:val="Prrafodelista"/>
+        <w:tabs>
+          <w:tab w:val="left" w:pos="994"/>
+        </w:tabs>
+        <w:spacing w:before="17"/>
+        <w:ind w:firstLine="0"/>
+        <w:jc w:val="both"/>
+      </w:pPr>
     </w:p>
     <w:p>
       <w:pPr>
@@ -348,9 +2214,15 @@
       </w:pPr>
       <w:r>
         <w:rPr>
-          <w:spacing w:val="-4"/>
-        </w:rPr>
-        <w:t>DWDM</w:t>
+          <w:spacing w:val="-5"/>
+        </w:rPr>
+        <w:t>WDM</w:t>
+      </w:r>
+      <w:r>
+        <w:rPr>
+          <w:spacing w:val="-5"/>
+        </w:rPr>
+        <w:t xml:space="preserve"> Y DWDM</w:t>
       </w:r>
     </w:p>
     <w:p>
@@ -375,6 +2247,54 @@
       </w:r>
       <w:proofErr w:type="spellEnd"/>
       <w:r>
+        <w:t xml:space="preserve"> por división en longitudes de onda (WDM)</w:t>
+      </w:r>
+      <w:r>
+        <w:t xml:space="preserve"> es una</w:t>
+      </w:r>
+      <w:r>
+        <w:t xml:space="preserve"> técnica</w:t>
+      </w:r>
+      <w:r>
+        <w:t xml:space="preserve"> que</w:t>
+      </w:r>
+      <w:r>
+        <w:t xml:space="preserve"> aprovecha que un solo hilo de fibra puede transportar simultáneamente múltiples haces de luz, cada uno en una longitud de onda distinta. Cada canal óptico corresponde a un color de luz diferente, generado mediante un láser, y todos son combinados por un multiplexor para viajar juntos en la misma fibra. En el extremo receptor, un demultiplexor separa los haces. Esta técnica permite aprovechar al máximo la capacidad de la fibra sin necesidad de tender más enlaces, aunque requiere equipos láser precisos y costosos.</w:t>
+      </w:r>
+    </w:p>
+    <w:p>
+      <w:pPr>
+        <w:pStyle w:val="Prrafodelista"/>
+        <w:tabs>
+          <w:tab w:val="left" w:pos="994"/>
+        </w:tabs>
+        <w:spacing w:before="17"/>
+        <w:ind w:firstLine="0"/>
+        <w:jc w:val="both"/>
+      </w:pPr>
+    </w:p>
+    <w:p>
+      <w:pPr>
+        <w:pStyle w:val="Prrafodelista"/>
+        <w:tabs>
+          <w:tab w:val="left" w:pos="994"/>
+        </w:tabs>
+        <w:spacing w:before="17"/>
+        <w:ind w:firstLine="0"/>
+        <w:jc w:val="both"/>
+      </w:pPr>
+      <w:r>
+        <w:t>L</w:t>
+      </w:r>
+      <w:r>
+        <w:t xml:space="preserve">a </w:t>
+      </w:r>
+      <w:proofErr w:type="spellStart"/>
+      <w:r>
+        <w:t>multiplexión</w:t>
+      </w:r>
+      <w:proofErr w:type="spellEnd"/>
+      <w:r>
         <w:t xml:space="preserve"> densa en longitudes de onda (DWDM)</w:t>
       </w:r>
       <w:r>
@@ -383,6 +2303,594 @@
       <w:r>
         <w:t>. En este caso, los canales se encuentran mucho más próximos entre sí, con espaciados de apenas 25 a 100 GHz, lo que permite transmitir decenas o incluso cientos de señales en paralelo dentro de una única fibra. Gracias a los amplificadores ópticos, como los basados en fibra dopada con erbio (EDFA), es posible mantener la señal a lo largo de cientos de kilómetros sin necesidad de regeneración eléctrica. DWDM es la tecnología utilizada en las redes troncales de Internet y en enlaces submarinos, alcanzando capacidades de varios terabits por segundo.</w:t>
       </w:r>
+    </w:p>
+    <w:p>
+      <w:pPr>
+        <w:pStyle w:val="Prrafodelista"/>
+        <w:tabs>
+          <w:tab w:val="left" w:pos="994"/>
+        </w:tabs>
+        <w:spacing w:before="17"/>
+        <w:ind w:firstLine="0"/>
+        <w:jc w:val="both"/>
+      </w:pPr>
+    </w:p>
+    <w:p>
+      <w:pPr>
+        <w:pStyle w:val="Prrafodelista"/>
+        <w:tabs>
+          <w:tab w:val="left" w:pos="994"/>
+        </w:tabs>
+        <w:spacing w:before="17"/>
+        <w:ind w:firstLine="0"/>
+        <w:jc w:val="both"/>
+      </w:pPr>
+      <w:r>
+        <w:rPr>
+          <w:b/>
+          <w:bCs/>
+          <w:noProof/>
+        </w:rPr>
+        <w:drawing>
+          <wp:inline distT="0" distB="0" distL="0" distR="0" wp14:anchorId="1270A04E" wp14:editId="518B055D">
+            <wp:extent cx="6040120" cy="1842721"/>
+            <wp:effectExtent l="0" t="0" r="0" b="5715"/>
+            <wp:docPr id="16" name="Imagen 16"/>
+            <wp:cNvGraphicFramePr>
+              <a:graphicFrameLocks xmlns:a="http://schemas.openxmlformats.org/drawingml/2006/main" noChangeAspect="1"/>
+            </wp:cNvGraphicFramePr>
+            <a:graphic xmlns:a="http://schemas.openxmlformats.org/drawingml/2006/main">
+              <a:graphicData uri="http://schemas.openxmlformats.org/drawingml/2006/picture">
+                <pic:pic xmlns:pic="http://schemas.openxmlformats.org/drawingml/2006/picture">
+                  <pic:nvPicPr>
+                    <pic:cNvPr id="1" name=""/>
+                    <pic:cNvPicPr/>
+                  </pic:nvPicPr>
+                  <pic:blipFill>
+                    <a:blip r:embed="rId16"/>
+                    <a:stretch>
+                      <a:fillRect/>
+                    </a:stretch>
+                  </pic:blipFill>
+                  <pic:spPr>
+                    <a:xfrm>
+                      <a:off x="0" y="0"/>
+                      <a:ext cx="6040120" cy="1842721"/>
+                    </a:xfrm>
+                    <a:prstGeom prst="rect">
+                      <a:avLst/>
+                    </a:prstGeom>
+                  </pic:spPr>
+                </pic:pic>
+              </a:graphicData>
+            </a:graphic>
+          </wp:inline>
+        </w:drawing>
+      </w:r>
+    </w:p>
+    <w:p>
+      <w:pPr>
+        <w:ind w:left="1354"/>
+        <w:rPr>
+          <w:rStyle w:val="nfasissutil"/>
+          <w:u w:val="single"/>
+        </w:rPr>
+      </w:pPr>
+      <w:r>
+        <w:rPr>
+          <w:rStyle w:val="nfasissutil"/>
+          <w:u w:val="single"/>
+        </w:rPr>
+        <w:t>Funcionamiento</w:t>
+      </w:r>
+    </w:p>
+    <w:p>
+      <w:pPr>
+        <w:pStyle w:val="Prrafodelista"/>
+        <w:widowControl/>
+        <w:numPr>
+          <w:ilvl w:val="0"/>
+          <w:numId w:val="18"/>
+        </w:numPr>
+        <w:autoSpaceDE/>
+        <w:autoSpaceDN/>
+        <w:spacing w:after="160" w:line="278" w:lineRule="auto"/>
+        <w:ind w:left="2074"/>
+        <w:contextualSpacing/>
+      </w:pPr>
+      <w:r>
+        <w:t xml:space="preserve">Varias señales ópticas entran al </w:t>
+      </w:r>
+      <w:r>
+        <w:rPr>
+          <w:b/>
+          <w:bCs/>
+        </w:rPr>
+        <w:t>multiplexor óptico</w:t>
+      </w:r>
+      <w:r>
+        <w:t xml:space="preserve">, cada una en una </w:t>
+      </w:r>
+      <w:r>
+        <w:rPr>
+          <w:b/>
+          <w:bCs/>
+        </w:rPr>
+        <w:t>longitud de onda diferente</w:t>
+      </w:r>
+      <w:r>
+        <w:t xml:space="preserve"> (λ1, λ2,</w:t>
+      </w:r>
+      <w:r>
+        <w:t xml:space="preserve"> </w:t>
+      </w:r>
+      <w:r>
+        <w:t>λ3...).</w:t>
+      </w:r>
+    </w:p>
+    <w:p>
+      <w:pPr>
+        <w:pStyle w:val="Prrafodelista"/>
+        <w:widowControl/>
+        <w:numPr>
+          <w:ilvl w:val="0"/>
+          <w:numId w:val="18"/>
+        </w:numPr>
+        <w:autoSpaceDE/>
+        <w:autoSpaceDN/>
+        <w:spacing w:after="160" w:line="278" w:lineRule="auto"/>
+        <w:ind w:left="2074"/>
+        <w:contextualSpacing/>
+      </w:pPr>
+      <w:r>
+        <w:t xml:space="preserve">Se combinan y viajan juntas por una </w:t>
+      </w:r>
+      <w:r>
+        <w:rPr>
+          <w:b/>
+          <w:bCs/>
+        </w:rPr>
+        <w:t>única fibra óptica</w:t>
+      </w:r>
+      <w:r>
+        <w:t>.</w:t>
+      </w:r>
+    </w:p>
+    <w:p>
+      <w:pPr>
+        <w:pStyle w:val="Prrafodelista"/>
+        <w:widowControl/>
+        <w:numPr>
+          <w:ilvl w:val="0"/>
+          <w:numId w:val="18"/>
+        </w:numPr>
+        <w:autoSpaceDE/>
+        <w:autoSpaceDN/>
+        <w:spacing w:after="160" w:line="278" w:lineRule="auto"/>
+        <w:ind w:left="2074"/>
+        <w:contextualSpacing/>
+      </w:pPr>
+      <w:r>
+        <w:t xml:space="preserve">En el receptor, el </w:t>
+      </w:r>
+      <w:r>
+        <w:rPr>
+          <w:b/>
+          <w:bCs/>
+        </w:rPr>
+        <w:t>demultiplexor óptico</w:t>
+      </w:r>
+      <w:r>
+        <w:t xml:space="preserve"> separa las señales según su longitud de onda.</w:t>
+      </w:r>
+    </w:p>
+    <w:p>
+      <w:pPr>
+        <w:ind w:left="1714"/>
+        <w:jc w:val="center"/>
+        <w:rPr>
+          <w:rStyle w:val="nfasissutil"/>
+          <w:i w:val="0"/>
+          <w:iCs w:val="0"/>
+        </w:rPr>
+      </w:pPr>
+      <w:r>
+        <w:rPr>
+          <w:rStyle w:val="nfasissutil"/>
+          <w:i w:val="0"/>
+          <w:iCs w:val="0"/>
+          <w:noProof/>
+        </w:rPr>
+        <w:lastRenderedPageBreak/>
+        <w:drawing>
+          <wp:inline distT="0" distB="0" distL="0" distR="0" wp14:anchorId="2D7A3B7D" wp14:editId="4548E527">
+            <wp:extent cx="5212923" cy="1819275"/>
+            <wp:effectExtent l="0" t="0" r="6985" b="0"/>
+            <wp:docPr id="17" name="Imagen 17"/>
+            <wp:cNvGraphicFramePr>
+              <a:graphicFrameLocks xmlns:a="http://schemas.openxmlformats.org/drawingml/2006/main" noChangeAspect="1"/>
+            </wp:cNvGraphicFramePr>
+            <a:graphic xmlns:a="http://schemas.openxmlformats.org/drawingml/2006/main">
+              <a:graphicData uri="http://schemas.openxmlformats.org/drawingml/2006/picture">
+                <pic:pic xmlns:pic="http://schemas.openxmlformats.org/drawingml/2006/picture">
+                  <pic:nvPicPr>
+                    <pic:cNvPr id="1" name=""/>
+                    <pic:cNvPicPr/>
+                  </pic:nvPicPr>
+                  <pic:blipFill>
+                    <a:blip r:embed="rId17"/>
+                    <a:stretch>
+                      <a:fillRect/>
+                    </a:stretch>
+                  </pic:blipFill>
+                  <pic:spPr>
+                    <a:xfrm>
+                      <a:off x="0" y="0"/>
+                      <a:ext cx="5218659" cy="1821277"/>
+                    </a:xfrm>
+                    <a:prstGeom prst="rect">
+                      <a:avLst/>
+                    </a:prstGeom>
+                  </pic:spPr>
+                </pic:pic>
+              </a:graphicData>
+            </a:graphic>
+          </wp:inline>
+        </w:drawing>
+      </w:r>
+    </w:p>
+    <w:p>
+      <w:pPr>
+        <w:ind w:left="1714"/>
+        <w:jc w:val="center"/>
+        <w:rPr>
+          <w:rStyle w:val="nfasissutil"/>
+          <w:i w:val="0"/>
+          <w:iCs w:val="0"/>
+        </w:rPr>
+      </w:pPr>
+    </w:p>
+    <w:p>
+      <w:pPr>
+        <w:ind w:left="1714"/>
+        <w:jc w:val="center"/>
+        <w:rPr>
+          <w:rStyle w:val="nfasissutil"/>
+          <w:i w:val="0"/>
+          <w:iCs w:val="0"/>
+        </w:rPr>
+      </w:pPr>
+    </w:p>
+    <w:p>
+      <w:pPr>
+        <w:ind w:left="1354"/>
+        <w:rPr>
+          <w:rStyle w:val="nfasissutil"/>
+          <w:u w:val="single"/>
+        </w:rPr>
+      </w:pPr>
+      <w:r>
+        <w:rPr>
+          <w:rStyle w:val="nfasissutil"/>
+          <w:u w:val="single"/>
+        </w:rPr>
+        <w:t>Tipos de WDM</w:t>
+      </w:r>
+    </w:p>
+    <w:p>
+      <w:pPr>
+        <w:pStyle w:val="Prrafodelista"/>
+        <w:widowControl/>
+        <w:numPr>
+          <w:ilvl w:val="0"/>
+          <w:numId w:val="19"/>
+        </w:numPr>
+        <w:autoSpaceDE/>
+        <w:autoSpaceDN/>
+        <w:spacing w:after="160" w:line="278" w:lineRule="auto"/>
+        <w:ind w:left="2074"/>
+        <w:contextualSpacing/>
+      </w:pPr>
+      <w:r>
+        <w:rPr>
+          <w:rStyle w:val="nfasissutil"/>
+        </w:rPr>
+        <w:t xml:space="preserve">Densa (DWDM, ‘Dense’ WDM): se utilizan 16 o más </w:t>
+      </w:r>
+      <w:r>
+        <w:t>λ</w:t>
+      </w:r>
+    </w:p>
+    <w:p>
+      <w:pPr>
+        <w:pStyle w:val="Prrafodelista"/>
+        <w:widowControl/>
+        <w:numPr>
+          <w:ilvl w:val="0"/>
+          <w:numId w:val="19"/>
+        </w:numPr>
+        <w:autoSpaceDE/>
+        <w:autoSpaceDN/>
+        <w:spacing w:after="160" w:line="278" w:lineRule="auto"/>
+        <w:ind w:left="2074"/>
+        <w:contextualSpacing/>
+      </w:pPr>
+      <w:r>
+        <w:rPr>
+          <w:rStyle w:val="nfasissutil"/>
+        </w:rPr>
+        <w:t>Ligera (CWDM ‘</w:t>
+      </w:r>
+      <w:proofErr w:type="spellStart"/>
+      <w:r>
+        <w:rPr>
+          <w:rStyle w:val="nfasissutil"/>
+        </w:rPr>
+        <w:t>Coarse</w:t>
+      </w:r>
+      <w:proofErr w:type="spellEnd"/>
+      <w:r>
+        <w:rPr>
+          <w:rStyle w:val="nfasissutil"/>
+        </w:rPr>
+        <w:t xml:space="preserve">’ WDM): se utilizan 2 o 4 </w:t>
+      </w:r>
+      <w:r>
+        <w:t>λ</w:t>
+      </w:r>
+    </w:p>
+    <w:p>
+      <w:pPr>
+        <w:ind w:left="1354"/>
+        <w:rPr>
+          <w:rStyle w:val="nfasissutil"/>
+          <w:u w:val="single"/>
+        </w:rPr>
+      </w:pPr>
+      <w:r>
+        <w:rPr>
+          <w:rStyle w:val="nfasissutil"/>
+          <w:u w:val="single"/>
+        </w:rPr>
+        <w:t>Ventajas</w:t>
+      </w:r>
+    </w:p>
+    <w:p>
+      <w:pPr>
+        <w:pStyle w:val="Prrafodelista"/>
+        <w:widowControl/>
+        <w:numPr>
+          <w:ilvl w:val="0"/>
+          <w:numId w:val="16"/>
+        </w:numPr>
+        <w:autoSpaceDE/>
+        <w:autoSpaceDN/>
+        <w:spacing w:after="160" w:line="278" w:lineRule="auto"/>
+        <w:ind w:left="2074"/>
+        <w:contextualSpacing/>
+        <w:rPr>
+          <w:rStyle w:val="nfasissutil"/>
+          <w:u w:val="single"/>
+        </w:rPr>
+      </w:pPr>
+      <w:r>
+        <w:rPr>
+          <w:rStyle w:val="nfasissutil"/>
+        </w:rPr>
+        <w:t>Multiplica la capacidad de transmisión sin instalar nuevas fibras.</w:t>
+      </w:r>
+    </w:p>
+    <w:p>
+      <w:pPr>
+        <w:pStyle w:val="Prrafodelista"/>
+        <w:widowControl/>
+        <w:numPr>
+          <w:ilvl w:val="0"/>
+          <w:numId w:val="16"/>
+        </w:numPr>
+        <w:autoSpaceDE/>
+        <w:autoSpaceDN/>
+        <w:spacing w:after="160" w:line="278" w:lineRule="auto"/>
+        <w:ind w:left="2074"/>
+        <w:contextualSpacing/>
+        <w:rPr>
+          <w:rStyle w:val="nfasissutil"/>
+          <w:u w:val="single"/>
+        </w:rPr>
+      </w:pPr>
+      <w:r>
+        <w:rPr>
+          <w:rStyle w:val="nfasissutil"/>
+        </w:rPr>
+        <w:t>Compatible con tecnologías existentes de datos, voz y video.</w:t>
+      </w:r>
+    </w:p>
+    <w:p>
+      <w:pPr>
+        <w:pStyle w:val="Prrafodelista"/>
+        <w:widowControl/>
+        <w:numPr>
+          <w:ilvl w:val="0"/>
+          <w:numId w:val="16"/>
+        </w:numPr>
+        <w:autoSpaceDE/>
+        <w:autoSpaceDN/>
+        <w:spacing w:after="160" w:line="278" w:lineRule="auto"/>
+        <w:ind w:left="2074"/>
+        <w:contextualSpacing/>
+        <w:rPr>
+          <w:rStyle w:val="nfasissutil"/>
+          <w:u w:val="single"/>
+        </w:rPr>
+      </w:pPr>
+      <w:r>
+        <w:rPr>
+          <w:rStyle w:val="nfasissutil"/>
+        </w:rPr>
+        <w:t>Bajo nivel de interferencia gracias a la separación óptica.</w:t>
+      </w:r>
+    </w:p>
+    <w:p>
+      <w:pPr>
+        <w:pStyle w:val="Subttulo"/>
+        <w:ind w:left="1354"/>
+        <w:rPr>
+          <w:rStyle w:val="nfasissutil"/>
+          <w:i w:val="0"/>
+          <w:iCs w:val="0"/>
+        </w:rPr>
+      </w:pPr>
+      <w:r>
+        <w:rPr>
+          <w:rStyle w:val="nfasissutil"/>
+        </w:rPr>
+        <w:t xml:space="preserve">Redes Ópticas (OTN – </w:t>
+      </w:r>
+      <w:proofErr w:type="spellStart"/>
+      <w:r>
+        <w:rPr>
+          <w:rStyle w:val="nfasissutil"/>
+        </w:rPr>
+        <w:t>Optical</w:t>
+      </w:r>
+      <w:proofErr w:type="spellEnd"/>
+      <w:r>
+        <w:rPr>
+          <w:rStyle w:val="nfasissutil"/>
+        </w:rPr>
+        <w:t xml:space="preserve"> </w:t>
+      </w:r>
+      <w:proofErr w:type="spellStart"/>
+      <w:r>
+        <w:rPr>
+          <w:rStyle w:val="nfasissutil"/>
+        </w:rPr>
+        <w:t>Transport</w:t>
+      </w:r>
+      <w:proofErr w:type="spellEnd"/>
+      <w:r>
+        <w:rPr>
+          <w:rStyle w:val="nfasissutil"/>
+        </w:rPr>
+        <w:t xml:space="preserve"> Network)</w:t>
+      </w:r>
+    </w:p>
+    <w:p>
+      <w:pPr>
+        <w:ind w:left="1354"/>
+      </w:pPr>
+      <w:r>
+        <w:t xml:space="preserve">Una </w:t>
+      </w:r>
+      <w:r>
+        <w:rPr>
+          <w:b/>
+          <w:bCs/>
+        </w:rPr>
+        <w:t>OTN</w:t>
+      </w:r>
+      <w:r>
+        <w:t xml:space="preserve"> es una infraestructura diseñada para </w:t>
+      </w:r>
+      <w:r>
+        <w:rPr>
+          <w:b/>
+          <w:bCs/>
+        </w:rPr>
+        <w:t>transportar datos digitales a través de redes de fibra óptica</w:t>
+      </w:r>
+      <w:r>
+        <w:t xml:space="preserve">, estandarizada por la </w:t>
+      </w:r>
+      <w:r>
+        <w:rPr>
+          <w:b/>
+          <w:bCs/>
+        </w:rPr>
+        <w:t>ITU-T (G.709)</w:t>
+      </w:r>
+      <w:r>
+        <w:t>.</w:t>
+      </w:r>
+    </w:p>
+    <w:p>
+      <w:pPr>
+        <w:ind w:left="1354"/>
+      </w:pPr>
+      <w:r>
+        <w:t>Se considera una evolución de SONET/SDH, pero optimizada para:</w:t>
+      </w:r>
+    </w:p>
+    <w:p>
+      <w:pPr>
+        <w:widowControl/>
+        <w:numPr>
+          <w:ilvl w:val="0"/>
+          <w:numId w:val="20"/>
+        </w:numPr>
+        <w:tabs>
+          <w:tab w:val="clear" w:pos="720"/>
+          <w:tab w:val="num" w:pos="2074"/>
+        </w:tabs>
+        <w:autoSpaceDE/>
+        <w:autoSpaceDN/>
+        <w:spacing w:after="160" w:line="278" w:lineRule="auto"/>
+        <w:ind w:left="2074"/>
+      </w:pPr>
+      <w:r>
+        <w:t>Grandes velocidades.</w:t>
+      </w:r>
+    </w:p>
+    <w:p>
+      <w:pPr>
+        <w:widowControl/>
+        <w:numPr>
+          <w:ilvl w:val="0"/>
+          <w:numId w:val="20"/>
+        </w:numPr>
+        <w:tabs>
+          <w:tab w:val="clear" w:pos="720"/>
+          <w:tab w:val="num" w:pos="2074"/>
+        </w:tabs>
+        <w:autoSpaceDE/>
+        <w:autoSpaceDN/>
+        <w:spacing w:after="160" w:line="278" w:lineRule="auto"/>
+        <w:ind w:left="2074"/>
+      </w:pPr>
+      <w:r>
+        <w:t>Multiplexación óptica (WDM/DWDM).</w:t>
+      </w:r>
+    </w:p>
+    <w:p>
+      <w:pPr>
+        <w:widowControl/>
+        <w:numPr>
+          <w:ilvl w:val="0"/>
+          <w:numId w:val="20"/>
+        </w:numPr>
+        <w:tabs>
+          <w:tab w:val="clear" w:pos="720"/>
+          <w:tab w:val="num" w:pos="2074"/>
+        </w:tabs>
+        <w:autoSpaceDE/>
+        <w:autoSpaceDN/>
+        <w:spacing w:after="160" w:line="278" w:lineRule="auto"/>
+        <w:ind w:left="2074"/>
+      </w:pPr>
+      <w:r>
+        <w:t>Gestión avanzada de errores.</w:t>
+      </w:r>
+    </w:p>
+    <w:p>
+      <w:pPr>
+        <w:pStyle w:val="Prrafodelista"/>
+        <w:tabs>
+          <w:tab w:val="left" w:pos="994"/>
+        </w:tabs>
+        <w:spacing w:before="17"/>
+        <w:ind w:firstLine="0"/>
+        <w:jc w:val="both"/>
+      </w:pPr>
     </w:p>
     <w:p>
       <w:pPr>
@@ -479,11 +2987,7 @@
       </w:r>
       <w:proofErr w:type="spellEnd"/>
       <w:r>
-        <w:t xml:space="preserve"> por división espacial (SDM) se basa en utilizar diferentes recursos físicos en el espacio para transportar varias señales en paralelo. Esto puede hacerse mediante múltiples pares de cables, fibras ópticas multinúcleo o antenas direccionales separadas. En comunicaciones </w:t>
-      </w:r>
-      <w:r>
-        <w:lastRenderedPageBreak/>
-        <w:t>inalámbricas, por ejemplo, la tecnología MIMO (</w:t>
+        <w:t xml:space="preserve"> por división espacial (SDM) se basa en utilizar diferentes recursos físicos en el espacio para transportar varias señales en paralelo. Esto puede hacerse mediante múltiples pares de cables, fibras ópticas multinúcleo o antenas direccionales separadas. En comunicaciones inalámbricas, por ejemplo, la tecnología MIMO (</w:t>
       </w:r>
       <w:proofErr w:type="spellStart"/>
       <w:r>
@@ -673,6 +3177,7 @@
         <w:jc w:val="both"/>
       </w:pPr>
       <w:r>
+        <w:lastRenderedPageBreak/>
         <w:t xml:space="preserve">¿Qué tipo de </w:t>
       </w:r>
       <w:proofErr w:type="spellStart"/>
@@ -681,7 +3186,15 @@
       </w:r>
       <w:proofErr w:type="spellEnd"/>
       <w:r>
-        <w:t xml:space="preserve"> es ésta?. Explique por qué. Haga</w:t>
+        <w:t xml:space="preserve"> es </w:t>
+      </w:r>
+      <w:proofErr w:type="gramStart"/>
+      <w:r>
+        <w:t>ésta?.</w:t>
+      </w:r>
+      <w:proofErr w:type="gramEnd"/>
+      <w:r>
+        <w:t xml:space="preserve"> Explique por qué. Haga</w:t>
       </w:r>
       <w:r>
         <w:rPr>
@@ -816,7 +3329,15 @@
         <w:t xml:space="preserve"> </w:t>
       </w:r>
       <w:r>
-        <w:t xml:space="preserve">6 MHz , el espectro de frecuencias utilizables del </w:t>
+        <w:t xml:space="preserve">6 </w:t>
+      </w:r>
+      <w:proofErr w:type="gramStart"/>
+      <w:r>
+        <w:t>MHz ,</w:t>
+      </w:r>
+      <w:proofErr w:type="gramEnd"/>
+      <w:r>
+        <w:t xml:space="preserve"> el espectro de frecuencias utilizables del </w:t>
       </w:r>
       <w:proofErr w:type="spellStart"/>
       <w:r>
@@ -1094,9 +3615,11 @@
         </w:rPr>
         <w:t xml:space="preserve"> </w:t>
       </w:r>
+      <w:proofErr w:type="gramStart"/>
       <w:r>
         <w:t>caso?.</w:t>
       </w:r>
+      <w:proofErr w:type="gramEnd"/>
       <w:r>
         <w:rPr>
           <w:spacing w:val="-5"/>
@@ -1761,14 +4284,7 @@
         <w:rPr>
           <w:spacing w:val="-2"/>
         </w:rPr>
-        <w:t xml:space="preserve">Como una ranura temporal está compuesta por 10 bits y la velocidad de salida es de 1 </w:t>
-      </w:r>
-      <w:r>
-        <w:rPr>
-          <w:spacing w:val="-2"/>
-        </w:rPr>
-        <w:lastRenderedPageBreak/>
-        <w:t xml:space="preserve">Mbps, la duración de la ranura temporal es 10 bits/1 Mbps = 10 µs. </w:t>
+        <w:t xml:space="preserve">Como una ranura temporal está compuesta por 10 bits y la velocidad de salida es de 1 Mbps, la duración de la ranura temporal es 10 bits/1 Mbps = 10 µs. </w:t>
       </w:r>
     </w:p>
     <w:p>
@@ -1960,6 +4476,7 @@
         <w:ind w:left="1609" w:hanging="359"/>
       </w:pPr>
       <w:r>
+        <w:lastRenderedPageBreak/>
         <w:t>Tiempo</w:t>
       </w:r>
       <w:r>
@@ -2202,7 +4719,15 @@
         <w:jc w:val="both"/>
       </w:pPr>
       <w:r>
-        <w:t>2 tipos de señales que generan datos a 2 velocidades diferentes? si es posible como lo implementa? que velocidad precisara ahora para el enlace multiplexado?</w:t>
+        <w:t xml:space="preserve">2 tipos de señales que generan datos a 2 velocidades diferentes? </w:t>
+      </w:r>
+      <w:proofErr w:type="gramStart"/>
+      <w:r>
+        <w:t>si es posible como lo implementa?</w:t>
+      </w:r>
+      <w:proofErr w:type="gramEnd"/>
+      <w:r>
+        <w:t xml:space="preserve"> que velocidad precisara ahora para el enlace multiplexado?</w:t>
       </w:r>
     </w:p>
     <w:p>
@@ -2939,7 +5464,21 @@
         <w:rPr>
           <w:sz w:val="24"/>
         </w:rPr>
-        <w:t>La velocidad de la línea de salida es igual a: 10*10 kbps + 20*5 kbps =  200 kbps</w:t>
+        <w:t xml:space="preserve">La velocidad de la línea de salida es igual a: 10*10 kbps + 20*5 kbps </w:t>
+      </w:r>
+      <w:proofErr w:type="gramStart"/>
+      <w:r>
+        <w:rPr>
+          <w:sz w:val="24"/>
+        </w:rPr>
+        <w:t>=  200</w:t>
+      </w:r>
+      <w:proofErr w:type="gramEnd"/>
+      <w:r>
+        <w:rPr>
+          <w:sz w:val="24"/>
+        </w:rPr>
+        <w:t xml:space="preserve"> kbps</w:t>
       </w:r>
     </w:p>
     <w:p>
@@ -2971,7 +5510,6 @@
         <w:rPr>
           <w:sz w:val="24"/>
         </w:rPr>
-        <w:lastRenderedPageBreak/>
         <w:t>El tiempo de ranura es: 5 bits/200 kbps = 0.025 ms = 25 µs</w:t>
       </w:r>
     </w:p>
@@ -3257,6 +5795,7 @@
         <w:jc w:val="both"/>
       </w:pPr>
       <w:r>
+        <w:lastRenderedPageBreak/>
         <w:t>Suponiendo</w:t>
       </w:r>
       <w:r>
@@ -3513,6 +6052,7 @@
         <w:ind w:left="1894" w:hanging="389"/>
         <w:jc w:val="both"/>
       </w:pPr>
+      <w:proofErr w:type="gramStart"/>
       <w:r>
         <w:t>¿</w:t>
       </w:r>
@@ -3525,6 +6065,7 @@
       <w:r>
         <w:t>Esto</w:t>
       </w:r>
+      <w:proofErr w:type="gramEnd"/>
       <w:r>
         <w:rPr>
           <w:spacing w:val="-4"/>
@@ -3764,7 +6305,21 @@
         <w:rPr>
           <w:spacing w:val="-2"/>
         </w:rPr>
-        <w:t>Cada canal tiene una velocidad de 9600 bps pero al hacer uso de él el 30% del tiempo, la capacidad aproximada que precisa el enlace es igual a: 10 * 9600 bps * 0.3 = 28800 bps.</w:t>
+        <w:t xml:space="preserve">Cada canal tiene una velocidad de 9600 </w:t>
+      </w:r>
+      <w:proofErr w:type="gramStart"/>
+      <w:r>
+        <w:rPr>
+          <w:spacing w:val="-2"/>
+        </w:rPr>
+        <w:t>bps</w:t>
+      </w:r>
+      <w:proofErr w:type="gramEnd"/>
+      <w:r>
+        <w:rPr>
+          <w:spacing w:val="-2"/>
+        </w:rPr>
+        <w:t xml:space="preserve"> pero al hacer uso de él el 30% del tiempo, la capacidad aproximada que precisa el enlace es igual a: 10 * 9600 bps * 0.3 = 28800 bps.</w:t>
       </w:r>
     </w:p>
     <w:p>
@@ -3836,7 +6391,15 @@
         <w:ind w:left="1895"/>
       </w:pPr>
       <w:r>
-        <w:t xml:space="preserve">Si todos los orígenes quieren enviar datos y la velocidad de salida del multiplexor es menor que la requerida puede existir pérdida de información ya que los datos de los buffer de entradas pisaran los datos. Sin embargo, esto se puede solucionar utilizando </w:t>
+        <w:t xml:space="preserve">Si todos los orígenes quieren enviar datos y la velocidad de salida del multiplexor es menor que la requerida puede existir pérdida de información ya que los datos </w:t>
+      </w:r>
+      <w:proofErr w:type="gramStart"/>
+      <w:r>
+        <w:t>de los buffer</w:t>
+      </w:r>
+      <w:proofErr w:type="gramEnd"/>
+      <w:r>
+        <w:t xml:space="preserve"> de entradas pisaran los datos. Sin embargo, esto se puede solucionar utilizando </w:t>
       </w:r>
       <w:proofErr w:type="spellStart"/>
       <w:r>
@@ -3908,6 +6471,26 @@
           <w:spacing w:val="-5"/>
         </w:rPr>
         <w:t>PDH</w:t>
+      </w:r>
+      <w:r>
+        <w:rPr>
+          <w:spacing w:val="-5"/>
+        </w:rPr>
+        <w:t xml:space="preserve"> (Jerarquía digital </w:t>
+      </w:r>
+      <w:proofErr w:type="spellStart"/>
+      <w:r>
+        <w:rPr>
+          <w:spacing w:val="-5"/>
+        </w:rPr>
+        <w:t>plesiocrónica</w:t>
+      </w:r>
+      <w:proofErr w:type="spellEnd"/>
+      <w:r>
+        <w:rPr>
+          <w:spacing w:val="-5"/>
+        </w:rPr>
+        <w:t>)</w:t>
       </w:r>
     </w:p>
     <w:p>
@@ -4212,7 +6795,7 @@
                     <pic:cNvPicPr/>
                   </pic:nvPicPr>
                   <pic:blipFill>
-                    <a:blip r:embed="rId8"/>
+                    <a:blip r:embed="rId18"/>
                     <a:stretch>
                       <a:fillRect/>
                     </a:stretch>
@@ -4285,7 +6868,7 @@
                     <pic:cNvPicPr/>
                   </pic:nvPicPr>
                   <pic:blipFill>
-                    <a:blip r:embed="rId9" cstate="print"/>
+                    <a:blip r:embed="rId19" cstate="print"/>
                     <a:stretch>
                       <a:fillRect/>
                     </a:stretch>
@@ -5025,7 +7608,7 @@
                 <w:szCs w:val="24"/>
                 <w:lang w:val="en-US"/>
               </w:rPr>
-              <w:t>32</w:t>
+              <w:t>28</w:t>
             </w:r>
           </w:p>
         </w:tc>
@@ -5052,7 +7635,7 @@
                 <w:szCs w:val="24"/>
                 <w:lang w:val="en-US"/>
               </w:rPr>
-              <w:t>12</w:t>
+              <w:t>8</w:t>
             </w:r>
           </w:p>
         </w:tc>
@@ -5587,7 +8170,25 @@
         <w:jc w:val="both"/>
       </w:pPr>
       <w:r>
-        <w:t xml:space="preserve">De forma similar se ha especificado para el otro estándar un enlace T1 con 24 canales y 1,544 Mbps. Tanto para E1 como para T1 se han especificado niveles superiores de </w:t>
+        <w:t>De forma similar se ha especificado para el otro estándar un enlace T1 con 24 canales</w:t>
+      </w:r>
+      <w:r>
+        <w:t xml:space="preserve"> de 8 bits más un bit de delimitación</w:t>
+      </w:r>
+      <w:r>
+        <w:t xml:space="preserve"> y</w:t>
+      </w:r>
+      <w:r>
+        <w:t xml:space="preserve"> su velocidad de transmisión es</w:t>
+      </w:r>
+      <w:r>
+        <w:t xml:space="preserve"> 1,544 Mbps. </w:t>
+      </w:r>
+      <w:r>
+        <w:t xml:space="preserve">En este estándar se toma una muestra de 8 bits por canas: 7 bits de datos y 1 bit de control. </w:t>
+      </w:r>
+      <w:r>
+        <w:t xml:space="preserve">Tanto para E1 como para T1 se han especificado niveles superiores de </w:t>
       </w:r>
       <w:proofErr w:type="spellStart"/>
       <w:r>
@@ -5597,16 +8198,9 @@
       <w:r>
         <w:t>. Así, en el nivel 2, la portadora E2 agrupa 4 entradas E1 resultando una velocidad de 8.448Mbps, y así sucesivamente. En el otro estándar, y usando órdenes de multiplicidad distintos, a partir de T1 se han especificado enlaces T2, T3, etc.</w:t>
       </w:r>
-    </w:p>
-    <w:p>
-      <w:pPr>
-        <w:tabs>
-          <w:tab w:val="left" w:pos="994"/>
-        </w:tabs>
-        <w:spacing w:before="17"/>
-        <w:ind w:left="590"/>
-        <w:jc w:val="both"/>
-      </w:pPr>
+      <w:r>
+        <w:t xml:space="preserve"> </w:t>
+      </w:r>
     </w:p>
     <w:p>
       <w:pPr>
@@ -5637,7 +8231,7 @@
                     <pic:cNvPicPr/>
                   </pic:nvPicPr>
                   <pic:blipFill rotWithShape="1">
-                    <a:blip r:embed="rId10">
+                    <a:blip r:embed="rId20">
                       <a:extLst>
                         <a:ext uri="{28A0092B-C50C-407E-A947-70E740481C1C}">
                           <a14:useLocalDpi xmlns:a14="http://schemas.microsoft.com/office/drawing/2010/main" val="0"/>
@@ -5700,7 +8294,7 @@
                     <pic:cNvPicPr/>
                   </pic:nvPicPr>
                   <pic:blipFill>
-                    <a:blip r:embed="rId11"/>
+                    <a:blip r:embed="rId21"/>
                     <a:stretch>
                       <a:fillRect/>
                     </a:stretch>
@@ -6084,7 +8678,7 @@
                     <pic:cNvPicPr/>
                   </pic:nvPicPr>
                   <pic:blipFill>
-                    <a:blip r:embed="rId12"/>
+                    <a:blip r:embed="rId22"/>
                     <a:stretch>
                       <a:fillRect/>
                     </a:stretch>
@@ -6238,7 +8832,21 @@
         <w:rPr>
           <w:spacing w:val="-5"/>
         </w:rPr>
-        <w:t>La capacidad de STM-64 es 9,95328 Gbps mientras que la capacidad de E5 es  564,992 Mbps.</w:t>
+        <w:t xml:space="preserve">La capacidad de STM-64 es 9,95328 Gbps mientras que la capacidad de E5 </w:t>
+      </w:r>
+      <w:proofErr w:type="gramStart"/>
+      <w:r>
+        <w:rPr>
+          <w:spacing w:val="-5"/>
+        </w:rPr>
+        <w:t>es  564,992</w:t>
+      </w:r>
+      <w:proofErr w:type="gramEnd"/>
+      <w:r>
+        <w:rPr>
+          <w:spacing w:val="-5"/>
+        </w:rPr>
+        <w:t xml:space="preserve"> Mbps.</w:t>
       </w:r>
     </w:p>
     <w:p>
@@ -6333,6 +8941,7 @@
         </w:tabs>
         <w:ind w:left="589" w:hanging="389"/>
       </w:pPr>
+      <w:proofErr w:type="gramStart"/>
       <w:r>
         <w:t>WDM</w:t>
       </w:r>
@@ -6345,6 +8954,7 @@
       <w:r>
         <w:t>,</w:t>
       </w:r>
+      <w:proofErr w:type="gramEnd"/>
       <w:r>
         <w:rPr>
           <w:spacing w:val="-2"/>
@@ -6803,7 +9413,7 @@
       </w:pPr>
     </w:p>
     <w:sectPr>
-      <w:headerReference w:type="default" r:id="rId13"/>
+      <w:headerReference w:type="default" r:id="rId23"/>
       <w:pgSz w:w="11920" w:h="16840"/>
       <w:pgMar w:top="3280" w:right="1133" w:bottom="280" w:left="1275" w:header="1450" w:footer="0" w:gutter="0"/>
       <w:cols w:space="720"/>
@@ -7890,6 +10500,232 @@
 <file path=word/numbering.xml><?xml version="1.0" encoding="utf-8"?>
 <w:numbering xmlns:wpc="http://schemas.microsoft.com/office/word/2010/wordprocessingCanvas" xmlns:cx="http://schemas.microsoft.com/office/drawing/2014/chartex" xmlns:cx1="http://schemas.microsoft.com/office/drawing/2015/9/8/chartex" xmlns:cx2="http://schemas.microsoft.com/office/drawing/2015/10/21/chartex" xmlns:cx3="http://schemas.microsoft.com/office/drawing/2016/5/9/chartex" xmlns:cx4="http://schemas.microsoft.com/office/drawing/2016/5/10/chartex" xmlns:cx5="http://schemas.microsoft.com/office/drawing/2016/5/11/chartex" xmlns:cx6="http://schemas.microsoft.com/office/drawing/2016/5/12/chartex" xmlns:cx7="http://schemas.microsoft.com/office/drawing/2016/5/13/chartex" xmlns:cx8="http://schemas.microsoft.com/office/drawing/2016/5/14/chartex" xmlns:mc="http://schemas.openxmlformats.org/markup-compatibility/2006" xmlns:aink="http://schemas.microsoft.com/office/drawing/2016/ink" xmlns:am3d="http://schemas.microsoft.com/office/drawing/2017/model3d" xmlns:o="urn:schemas-microsoft-com:office:office" xmlns:r="http://schemas.openxmlformats.org/officeDocument/2006/relationships" xmlns:m="http://schemas.openxmlformats.org/officeDocument/2006/math" xmlns:v="urn:schemas-microsoft-com:vml" xmlns:wp14="http://schemas.microsoft.com/office/word/2010/wordprocessingDrawing" xmlns:wp="http://schemas.openxmlformats.org/drawingml/2006/wordprocessingDrawing" xmlns:w10="urn:schemas-microsoft-com:office:word" xmlns:w="http://schemas.openxmlformats.org/wordprocessingml/2006/main" xmlns:w14="http://schemas.microsoft.com/office/word/2010/wordml" xmlns:w15="http://schemas.microsoft.com/office/word/2012/wordml" xmlns:w16cex="http://schemas.microsoft.com/office/word/2018/wordml/cex" xmlns:w16cid="http://schemas.microsoft.com/office/word/2016/wordml/cid" xmlns:w16="http://schemas.microsoft.com/office/word/2018/wordml" xmlns:w16sdtdh="http://schemas.microsoft.com/office/word/2020/wordml/sdtdatahash" xmlns:w16se="http://schemas.microsoft.com/office/word/2015/wordml/symex" xmlns:wpg="http://schemas.microsoft.com/office/word/2010/wordprocessingGroup" xmlns:wpi="http://schemas.microsoft.com/office/word/2010/wordprocessingInk" xmlns:wne="http://schemas.microsoft.com/office/word/2006/wordml" xmlns:wps="http://schemas.microsoft.com/office/word/2010/wordprocessingShape" mc:Ignorable="w14 w15 w16se w16cid w16 w16cex w16sdtdh wp14">
   <w:abstractNum w:abstractNumId="0" w15:restartNumberingAfterBreak="0">
+    <w:nsid w:val="04B4223C"/>
+    <w:multiLevelType w:val="hybridMultilevel"/>
+    <w:tmpl w:val="3772821A"/>
+    <w:lvl w:ilvl="0" w:tplc="2C0A0001">
+      <w:start w:val="1"/>
+      <w:numFmt w:val="bullet"/>
+      <w:lvlText w:val=""/>
+      <w:lvlJc w:val="left"/>
+      <w:pPr>
+        <w:ind w:left="720" w:hanging="360"/>
+      </w:pPr>
+      <w:rPr>
+        <w:rFonts w:ascii="Symbol" w:hAnsi="Symbol" w:hint="default"/>
+      </w:rPr>
+    </w:lvl>
+    <w:lvl w:ilvl="1" w:tplc="2C0A0003" w:tentative="1">
+      <w:start w:val="1"/>
+      <w:numFmt w:val="bullet"/>
+      <w:lvlText w:val="o"/>
+      <w:lvlJc w:val="left"/>
+      <w:pPr>
+        <w:ind w:left="1440" w:hanging="360"/>
+      </w:pPr>
+      <w:rPr>
+        <w:rFonts w:ascii="Courier New" w:hAnsi="Courier New" w:cs="Courier New" w:hint="default"/>
+      </w:rPr>
+    </w:lvl>
+    <w:lvl w:ilvl="2" w:tplc="2C0A0005" w:tentative="1">
+      <w:start w:val="1"/>
+      <w:numFmt w:val="bullet"/>
+      <w:lvlText w:val=""/>
+      <w:lvlJc w:val="left"/>
+      <w:pPr>
+        <w:ind w:left="2160" w:hanging="360"/>
+      </w:pPr>
+      <w:rPr>
+        <w:rFonts w:ascii="Wingdings" w:hAnsi="Wingdings" w:hint="default"/>
+      </w:rPr>
+    </w:lvl>
+    <w:lvl w:ilvl="3" w:tplc="2C0A0001" w:tentative="1">
+      <w:start w:val="1"/>
+      <w:numFmt w:val="bullet"/>
+      <w:lvlText w:val=""/>
+      <w:lvlJc w:val="left"/>
+      <w:pPr>
+        <w:ind w:left="2880" w:hanging="360"/>
+      </w:pPr>
+      <w:rPr>
+        <w:rFonts w:ascii="Symbol" w:hAnsi="Symbol" w:hint="default"/>
+      </w:rPr>
+    </w:lvl>
+    <w:lvl w:ilvl="4" w:tplc="2C0A0003" w:tentative="1">
+      <w:start w:val="1"/>
+      <w:numFmt w:val="bullet"/>
+      <w:lvlText w:val="o"/>
+      <w:lvlJc w:val="left"/>
+      <w:pPr>
+        <w:ind w:left="3600" w:hanging="360"/>
+      </w:pPr>
+      <w:rPr>
+        <w:rFonts w:ascii="Courier New" w:hAnsi="Courier New" w:cs="Courier New" w:hint="default"/>
+      </w:rPr>
+    </w:lvl>
+    <w:lvl w:ilvl="5" w:tplc="2C0A0005" w:tentative="1">
+      <w:start w:val="1"/>
+      <w:numFmt w:val="bullet"/>
+      <w:lvlText w:val=""/>
+      <w:lvlJc w:val="left"/>
+      <w:pPr>
+        <w:ind w:left="4320" w:hanging="360"/>
+      </w:pPr>
+      <w:rPr>
+        <w:rFonts w:ascii="Wingdings" w:hAnsi="Wingdings" w:hint="default"/>
+      </w:rPr>
+    </w:lvl>
+    <w:lvl w:ilvl="6" w:tplc="2C0A0001" w:tentative="1">
+      <w:start w:val="1"/>
+      <w:numFmt w:val="bullet"/>
+      <w:lvlText w:val=""/>
+      <w:lvlJc w:val="left"/>
+      <w:pPr>
+        <w:ind w:left="5040" w:hanging="360"/>
+      </w:pPr>
+      <w:rPr>
+        <w:rFonts w:ascii="Symbol" w:hAnsi="Symbol" w:hint="default"/>
+      </w:rPr>
+    </w:lvl>
+    <w:lvl w:ilvl="7" w:tplc="2C0A0003" w:tentative="1">
+      <w:start w:val="1"/>
+      <w:numFmt w:val="bullet"/>
+      <w:lvlText w:val="o"/>
+      <w:lvlJc w:val="left"/>
+      <w:pPr>
+        <w:ind w:left="5760" w:hanging="360"/>
+      </w:pPr>
+      <w:rPr>
+        <w:rFonts w:ascii="Courier New" w:hAnsi="Courier New" w:cs="Courier New" w:hint="default"/>
+      </w:rPr>
+    </w:lvl>
+    <w:lvl w:ilvl="8" w:tplc="2C0A0005" w:tentative="1">
+      <w:start w:val="1"/>
+      <w:numFmt w:val="bullet"/>
+      <w:lvlText w:val=""/>
+      <w:lvlJc w:val="left"/>
+      <w:pPr>
+        <w:ind w:left="6480" w:hanging="360"/>
+      </w:pPr>
+      <w:rPr>
+        <w:rFonts w:ascii="Wingdings" w:hAnsi="Wingdings" w:hint="default"/>
+      </w:rPr>
+    </w:lvl>
+  </w:abstractNum>
+  <w:abstractNum w:abstractNumId="1" w15:restartNumberingAfterBreak="0">
+    <w:nsid w:val="05B22C24"/>
+    <w:multiLevelType w:val="hybridMultilevel"/>
+    <w:tmpl w:val="2040ADAC"/>
+    <w:lvl w:ilvl="0" w:tplc="2C0A0001">
+      <w:start w:val="1"/>
+      <w:numFmt w:val="bullet"/>
+      <w:lvlText w:val=""/>
+      <w:lvlJc w:val="left"/>
+      <w:pPr>
+        <w:ind w:left="720" w:hanging="360"/>
+      </w:pPr>
+      <w:rPr>
+        <w:rFonts w:ascii="Symbol" w:hAnsi="Symbol" w:hint="default"/>
+      </w:rPr>
+    </w:lvl>
+    <w:lvl w:ilvl="1" w:tplc="2C0A0003" w:tentative="1">
+      <w:start w:val="1"/>
+      <w:numFmt w:val="bullet"/>
+      <w:lvlText w:val="o"/>
+      <w:lvlJc w:val="left"/>
+      <w:pPr>
+        <w:ind w:left="1440" w:hanging="360"/>
+      </w:pPr>
+      <w:rPr>
+        <w:rFonts w:ascii="Courier New" w:hAnsi="Courier New" w:cs="Courier New" w:hint="default"/>
+      </w:rPr>
+    </w:lvl>
+    <w:lvl w:ilvl="2" w:tplc="2C0A0005" w:tentative="1">
+      <w:start w:val="1"/>
+      <w:numFmt w:val="bullet"/>
+      <w:lvlText w:val=""/>
+      <w:lvlJc w:val="left"/>
+      <w:pPr>
+        <w:ind w:left="2160" w:hanging="360"/>
+      </w:pPr>
+      <w:rPr>
+        <w:rFonts w:ascii="Wingdings" w:hAnsi="Wingdings" w:hint="default"/>
+      </w:rPr>
+    </w:lvl>
+    <w:lvl w:ilvl="3" w:tplc="2C0A0001" w:tentative="1">
+      <w:start w:val="1"/>
+      <w:numFmt w:val="bullet"/>
+      <w:lvlText w:val=""/>
+      <w:lvlJc w:val="left"/>
+      <w:pPr>
+        <w:ind w:left="2880" w:hanging="360"/>
+      </w:pPr>
+      <w:rPr>
+        <w:rFonts w:ascii="Symbol" w:hAnsi="Symbol" w:hint="default"/>
+      </w:rPr>
+    </w:lvl>
+    <w:lvl w:ilvl="4" w:tplc="2C0A0003" w:tentative="1">
+      <w:start w:val="1"/>
+      <w:numFmt w:val="bullet"/>
+      <w:lvlText w:val="o"/>
+      <w:lvlJc w:val="left"/>
+      <w:pPr>
+        <w:ind w:left="3600" w:hanging="360"/>
+      </w:pPr>
+      <w:rPr>
+        <w:rFonts w:ascii="Courier New" w:hAnsi="Courier New" w:cs="Courier New" w:hint="default"/>
+      </w:rPr>
+    </w:lvl>
+    <w:lvl w:ilvl="5" w:tplc="2C0A0005" w:tentative="1">
+      <w:start w:val="1"/>
+      <w:numFmt w:val="bullet"/>
+      <w:lvlText w:val=""/>
+      <w:lvlJc w:val="left"/>
+      <w:pPr>
+        <w:ind w:left="4320" w:hanging="360"/>
+      </w:pPr>
+      <w:rPr>
+        <w:rFonts w:ascii="Wingdings" w:hAnsi="Wingdings" w:hint="default"/>
+      </w:rPr>
+    </w:lvl>
+    <w:lvl w:ilvl="6" w:tplc="2C0A0001" w:tentative="1">
+      <w:start w:val="1"/>
+      <w:numFmt w:val="bullet"/>
+      <w:lvlText w:val=""/>
+      <w:lvlJc w:val="left"/>
+      <w:pPr>
+        <w:ind w:left="5040" w:hanging="360"/>
+      </w:pPr>
+      <w:rPr>
+        <w:rFonts w:ascii="Symbol" w:hAnsi="Symbol" w:hint="default"/>
+      </w:rPr>
+    </w:lvl>
+    <w:lvl w:ilvl="7" w:tplc="2C0A0003" w:tentative="1">
+      <w:start w:val="1"/>
+      <w:numFmt w:val="bullet"/>
+      <w:lvlText w:val="o"/>
+      <w:lvlJc w:val="left"/>
+      <w:pPr>
+        <w:ind w:left="5760" w:hanging="360"/>
+      </w:pPr>
+      <w:rPr>
+        <w:rFonts w:ascii="Courier New" w:hAnsi="Courier New" w:cs="Courier New" w:hint="default"/>
+      </w:rPr>
+    </w:lvl>
+    <w:lvl w:ilvl="8" w:tplc="2C0A0005" w:tentative="1">
+      <w:start w:val="1"/>
+      <w:numFmt w:val="bullet"/>
+      <w:lvlText w:val=""/>
+      <w:lvlJc w:val="left"/>
+      <w:pPr>
+        <w:ind w:left="6480" w:hanging="360"/>
+      </w:pPr>
+      <w:rPr>
+        <w:rFonts w:ascii="Wingdings" w:hAnsi="Wingdings" w:hint="default"/>
+      </w:rPr>
+    </w:lvl>
+  </w:abstractNum>
+  <w:abstractNum w:abstractNumId="2" w15:restartNumberingAfterBreak="0">
     <w:nsid w:val="0A131C49"/>
     <w:multiLevelType w:val="multilevel"/>
     <w:tmpl w:val="8310857A"/>
@@ -8038,7 +10874,206 @@
       </w:rPr>
     </w:lvl>
   </w:abstractNum>
-  <w:abstractNum w:abstractNumId="1" w15:restartNumberingAfterBreak="0">
+  <w:abstractNum w:abstractNumId="3" w15:restartNumberingAfterBreak="0">
+    <w:nsid w:val="1BB063D8"/>
+    <w:multiLevelType w:val="hybridMultilevel"/>
+    <w:tmpl w:val="52F87A50"/>
+    <w:lvl w:ilvl="0" w:tplc="2C0A000F">
+      <w:start w:val="1"/>
+      <w:numFmt w:val="decimal"/>
+      <w:lvlText w:val="%1."/>
+      <w:lvlJc w:val="left"/>
+      <w:pPr>
+        <w:ind w:left="720" w:hanging="360"/>
+      </w:pPr>
+    </w:lvl>
+    <w:lvl w:ilvl="1" w:tplc="0409000F">
+      <w:start w:val="1"/>
+      <w:numFmt w:val="decimal"/>
+      <w:lvlText w:val="%2."/>
+      <w:lvlJc w:val="left"/>
+      <w:pPr>
+        <w:ind w:left="1440" w:hanging="360"/>
+      </w:pPr>
+    </w:lvl>
+    <w:lvl w:ilvl="2" w:tplc="2C0A001B">
+      <w:start w:val="1"/>
+      <w:numFmt w:val="lowerRoman"/>
+      <w:lvlText w:val="%3."/>
+      <w:lvlJc w:val="right"/>
+      <w:pPr>
+        <w:ind w:left="2160" w:hanging="180"/>
+      </w:pPr>
+    </w:lvl>
+    <w:lvl w:ilvl="3" w:tplc="2C0A000F" w:tentative="1">
+      <w:start w:val="1"/>
+      <w:numFmt w:val="decimal"/>
+      <w:lvlText w:val="%4."/>
+      <w:lvlJc w:val="left"/>
+      <w:pPr>
+        <w:ind w:left="2880" w:hanging="360"/>
+      </w:pPr>
+    </w:lvl>
+    <w:lvl w:ilvl="4" w:tplc="2C0A0019" w:tentative="1">
+      <w:start w:val="1"/>
+      <w:numFmt w:val="lowerLetter"/>
+      <w:lvlText w:val="%5."/>
+      <w:lvlJc w:val="left"/>
+      <w:pPr>
+        <w:ind w:left="3600" w:hanging="360"/>
+      </w:pPr>
+    </w:lvl>
+    <w:lvl w:ilvl="5" w:tplc="2C0A001B" w:tentative="1">
+      <w:start w:val="1"/>
+      <w:numFmt w:val="lowerRoman"/>
+      <w:lvlText w:val="%6."/>
+      <w:lvlJc w:val="right"/>
+      <w:pPr>
+        <w:ind w:left="4320" w:hanging="180"/>
+      </w:pPr>
+    </w:lvl>
+    <w:lvl w:ilvl="6" w:tplc="2C0A000F" w:tentative="1">
+      <w:start w:val="1"/>
+      <w:numFmt w:val="decimal"/>
+      <w:lvlText w:val="%7."/>
+      <w:lvlJc w:val="left"/>
+      <w:pPr>
+        <w:ind w:left="5040" w:hanging="360"/>
+      </w:pPr>
+    </w:lvl>
+    <w:lvl w:ilvl="7" w:tplc="2C0A0019" w:tentative="1">
+      <w:start w:val="1"/>
+      <w:numFmt w:val="lowerLetter"/>
+      <w:lvlText w:val="%8."/>
+      <w:lvlJc w:val="left"/>
+      <w:pPr>
+        <w:ind w:left="5760" w:hanging="360"/>
+      </w:pPr>
+    </w:lvl>
+    <w:lvl w:ilvl="8" w:tplc="2C0A001B" w:tentative="1">
+      <w:start w:val="1"/>
+      <w:numFmt w:val="lowerRoman"/>
+      <w:lvlText w:val="%9."/>
+      <w:lvlJc w:val="right"/>
+      <w:pPr>
+        <w:ind w:left="6480" w:hanging="180"/>
+      </w:pPr>
+    </w:lvl>
+  </w:abstractNum>
+  <w:abstractNum w:abstractNumId="4" w15:restartNumberingAfterBreak="0">
+    <w:nsid w:val="1FDD0E66"/>
+    <w:multiLevelType w:val="hybridMultilevel"/>
+    <w:tmpl w:val="24369404"/>
+    <w:lvl w:ilvl="0" w:tplc="2C0A0003">
+      <w:start w:val="1"/>
+      <w:numFmt w:val="bullet"/>
+      <w:lvlText w:val="o"/>
+      <w:lvlJc w:val="left"/>
+      <w:pPr>
+        <w:ind w:left="720" w:hanging="360"/>
+      </w:pPr>
+      <w:rPr>
+        <w:rFonts w:ascii="Courier New" w:hAnsi="Courier New" w:cs="Courier New" w:hint="default"/>
+      </w:rPr>
+    </w:lvl>
+    <w:lvl w:ilvl="1" w:tplc="2C0A0003" w:tentative="1">
+      <w:start w:val="1"/>
+      <w:numFmt w:val="bullet"/>
+      <w:lvlText w:val="o"/>
+      <w:lvlJc w:val="left"/>
+      <w:pPr>
+        <w:ind w:left="1440" w:hanging="360"/>
+      </w:pPr>
+      <w:rPr>
+        <w:rFonts w:ascii="Courier New" w:hAnsi="Courier New" w:cs="Courier New" w:hint="default"/>
+      </w:rPr>
+    </w:lvl>
+    <w:lvl w:ilvl="2" w:tplc="2C0A0005" w:tentative="1">
+      <w:start w:val="1"/>
+      <w:numFmt w:val="bullet"/>
+      <w:lvlText w:val=""/>
+      <w:lvlJc w:val="left"/>
+      <w:pPr>
+        <w:ind w:left="2160" w:hanging="360"/>
+      </w:pPr>
+      <w:rPr>
+        <w:rFonts w:ascii="Wingdings" w:hAnsi="Wingdings" w:hint="default"/>
+      </w:rPr>
+    </w:lvl>
+    <w:lvl w:ilvl="3" w:tplc="2C0A0001" w:tentative="1">
+      <w:start w:val="1"/>
+      <w:numFmt w:val="bullet"/>
+      <w:lvlText w:val=""/>
+      <w:lvlJc w:val="left"/>
+      <w:pPr>
+        <w:ind w:left="2880" w:hanging="360"/>
+      </w:pPr>
+      <w:rPr>
+        <w:rFonts w:ascii="Symbol" w:hAnsi="Symbol" w:hint="default"/>
+      </w:rPr>
+    </w:lvl>
+    <w:lvl w:ilvl="4" w:tplc="2C0A0003" w:tentative="1">
+      <w:start w:val="1"/>
+      <w:numFmt w:val="bullet"/>
+      <w:lvlText w:val="o"/>
+      <w:lvlJc w:val="left"/>
+      <w:pPr>
+        <w:ind w:left="3600" w:hanging="360"/>
+      </w:pPr>
+      <w:rPr>
+        <w:rFonts w:ascii="Courier New" w:hAnsi="Courier New" w:cs="Courier New" w:hint="default"/>
+      </w:rPr>
+    </w:lvl>
+    <w:lvl w:ilvl="5" w:tplc="2C0A0005" w:tentative="1">
+      <w:start w:val="1"/>
+      <w:numFmt w:val="bullet"/>
+      <w:lvlText w:val=""/>
+      <w:lvlJc w:val="left"/>
+      <w:pPr>
+        <w:ind w:left="4320" w:hanging="360"/>
+      </w:pPr>
+      <w:rPr>
+        <w:rFonts w:ascii="Wingdings" w:hAnsi="Wingdings" w:hint="default"/>
+      </w:rPr>
+    </w:lvl>
+    <w:lvl w:ilvl="6" w:tplc="2C0A0001" w:tentative="1">
+      <w:start w:val="1"/>
+      <w:numFmt w:val="bullet"/>
+      <w:lvlText w:val=""/>
+      <w:lvlJc w:val="left"/>
+      <w:pPr>
+        <w:ind w:left="5040" w:hanging="360"/>
+      </w:pPr>
+      <w:rPr>
+        <w:rFonts w:ascii="Symbol" w:hAnsi="Symbol" w:hint="default"/>
+      </w:rPr>
+    </w:lvl>
+    <w:lvl w:ilvl="7" w:tplc="2C0A0003" w:tentative="1">
+      <w:start w:val="1"/>
+      <w:numFmt w:val="bullet"/>
+      <w:lvlText w:val="o"/>
+      <w:lvlJc w:val="left"/>
+      <w:pPr>
+        <w:ind w:left="5760" w:hanging="360"/>
+      </w:pPr>
+      <w:rPr>
+        <w:rFonts w:ascii="Courier New" w:hAnsi="Courier New" w:cs="Courier New" w:hint="default"/>
+      </w:rPr>
+    </w:lvl>
+    <w:lvl w:ilvl="8" w:tplc="2C0A0005" w:tentative="1">
+      <w:start w:val="1"/>
+      <w:numFmt w:val="bullet"/>
+      <w:lvlText w:val=""/>
+      <w:lvlJc w:val="left"/>
+      <w:pPr>
+        <w:ind w:left="6480" w:hanging="360"/>
+      </w:pPr>
+      <w:rPr>
+        <w:rFonts w:ascii="Wingdings" w:hAnsi="Wingdings" w:hint="default"/>
+      </w:rPr>
+    </w:lvl>
+  </w:abstractNum>
+  <w:abstractNum w:abstractNumId="5" w15:restartNumberingAfterBreak="0">
     <w:nsid w:val="318D1D34"/>
     <w:multiLevelType w:val="hybridMultilevel"/>
     <w:tmpl w:val="26004DEE"/>
@@ -8159,7 +11194,319 @@
       </w:rPr>
     </w:lvl>
   </w:abstractNum>
-  <w:abstractNum w:abstractNumId="2" w15:restartNumberingAfterBreak="0">
+  <w:abstractNum w:abstractNumId="6" w15:restartNumberingAfterBreak="0">
+    <w:nsid w:val="321B0305"/>
+    <w:multiLevelType w:val="hybridMultilevel"/>
+    <w:tmpl w:val="8228B96A"/>
+    <w:lvl w:ilvl="0" w:tplc="FFFFFFFF">
+      <w:start w:val="1"/>
+      <w:numFmt w:val="decimal"/>
+      <w:lvlText w:val="%1."/>
+      <w:lvlJc w:val="left"/>
+      <w:pPr>
+        <w:ind w:left="720" w:hanging="360"/>
+      </w:pPr>
+    </w:lvl>
+    <w:lvl w:ilvl="1" w:tplc="FFFFFFFF" w:tentative="1">
+      <w:start w:val="1"/>
+      <w:numFmt w:val="lowerLetter"/>
+      <w:lvlText w:val="%2."/>
+      <w:lvlJc w:val="left"/>
+      <w:pPr>
+        <w:ind w:left="1440" w:hanging="360"/>
+      </w:pPr>
+    </w:lvl>
+    <w:lvl w:ilvl="2" w:tplc="FFFFFFFF" w:tentative="1">
+      <w:start w:val="1"/>
+      <w:numFmt w:val="lowerRoman"/>
+      <w:lvlText w:val="%3."/>
+      <w:lvlJc w:val="right"/>
+      <w:pPr>
+        <w:ind w:left="2160" w:hanging="180"/>
+      </w:pPr>
+    </w:lvl>
+    <w:lvl w:ilvl="3" w:tplc="FFFFFFFF" w:tentative="1">
+      <w:start w:val="1"/>
+      <w:numFmt w:val="decimal"/>
+      <w:lvlText w:val="%4."/>
+      <w:lvlJc w:val="left"/>
+      <w:pPr>
+        <w:ind w:left="2880" w:hanging="360"/>
+      </w:pPr>
+    </w:lvl>
+    <w:lvl w:ilvl="4" w:tplc="FFFFFFFF" w:tentative="1">
+      <w:start w:val="1"/>
+      <w:numFmt w:val="lowerLetter"/>
+      <w:lvlText w:val="%5."/>
+      <w:lvlJc w:val="left"/>
+      <w:pPr>
+        <w:ind w:left="3600" w:hanging="360"/>
+      </w:pPr>
+    </w:lvl>
+    <w:lvl w:ilvl="5" w:tplc="FFFFFFFF" w:tentative="1">
+      <w:start w:val="1"/>
+      <w:numFmt w:val="lowerRoman"/>
+      <w:lvlText w:val="%6."/>
+      <w:lvlJc w:val="right"/>
+      <w:pPr>
+        <w:ind w:left="4320" w:hanging="180"/>
+      </w:pPr>
+    </w:lvl>
+    <w:lvl w:ilvl="6" w:tplc="FFFFFFFF" w:tentative="1">
+      <w:start w:val="1"/>
+      <w:numFmt w:val="decimal"/>
+      <w:lvlText w:val="%7."/>
+      <w:lvlJc w:val="left"/>
+      <w:pPr>
+        <w:ind w:left="5040" w:hanging="360"/>
+      </w:pPr>
+    </w:lvl>
+    <w:lvl w:ilvl="7" w:tplc="FFFFFFFF" w:tentative="1">
+      <w:start w:val="1"/>
+      <w:numFmt w:val="lowerLetter"/>
+      <w:lvlText w:val="%8."/>
+      <w:lvlJc w:val="left"/>
+      <w:pPr>
+        <w:ind w:left="5760" w:hanging="360"/>
+      </w:pPr>
+    </w:lvl>
+    <w:lvl w:ilvl="8" w:tplc="FFFFFFFF" w:tentative="1">
+      <w:start w:val="1"/>
+      <w:numFmt w:val="lowerRoman"/>
+      <w:lvlText w:val="%9."/>
+      <w:lvlJc w:val="right"/>
+      <w:pPr>
+        <w:ind w:left="6480" w:hanging="180"/>
+      </w:pPr>
+    </w:lvl>
+  </w:abstractNum>
+  <w:abstractNum w:abstractNumId="7" w15:restartNumberingAfterBreak="0">
+    <w:nsid w:val="3B0C03BF"/>
+    <w:multiLevelType w:val="hybridMultilevel"/>
+    <w:tmpl w:val="C3FE677E"/>
+    <w:lvl w:ilvl="0" w:tplc="2C0A0003">
+      <w:start w:val="1"/>
+      <w:numFmt w:val="bullet"/>
+      <w:lvlText w:val="o"/>
+      <w:lvlJc w:val="left"/>
+      <w:pPr>
+        <w:ind w:left="1440" w:hanging="360"/>
+      </w:pPr>
+      <w:rPr>
+        <w:rFonts w:ascii="Courier New" w:hAnsi="Courier New" w:cs="Courier New" w:hint="default"/>
+      </w:rPr>
+    </w:lvl>
+    <w:lvl w:ilvl="1" w:tplc="2C0A0003" w:tentative="1">
+      <w:start w:val="1"/>
+      <w:numFmt w:val="bullet"/>
+      <w:lvlText w:val="o"/>
+      <w:lvlJc w:val="left"/>
+      <w:pPr>
+        <w:ind w:left="2160" w:hanging="360"/>
+      </w:pPr>
+      <w:rPr>
+        <w:rFonts w:ascii="Courier New" w:hAnsi="Courier New" w:cs="Courier New" w:hint="default"/>
+      </w:rPr>
+    </w:lvl>
+    <w:lvl w:ilvl="2" w:tplc="2C0A0005" w:tentative="1">
+      <w:start w:val="1"/>
+      <w:numFmt w:val="bullet"/>
+      <w:lvlText w:val=""/>
+      <w:lvlJc w:val="left"/>
+      <w:pPr>
+        <w:ind w:left="2880" w:hanging="360"/>
+      </w:pPr>
+      <w:rPr>
+        <w:rFonts w:ascii="Wingdings" w:hAnsi="Wingdings" w:hint="default"/>
+      </w:rPr>
+    </w:lvl>
+    <w:lvl w:ilvl="3" w:tplc="2C0A0001" w:tentative="1">
+      <w:start w:val="1"/>
+      <w:numFmt w:val="bullet"/>
+      <w:lvlText w:val=""/>
+      <w:lvlJc w:val="left"/>
+      <w:pPr>
+        <w:ind w:left="3600" w:hanging="360"/>
+      </w:pPr>
+      <w:rPr>
+        <w:rFonts w:ascii="Symbol" w:hAnsi="Symbol" w:hint="default"/>
+      </w:rPr>
+    </w:lvl>
+    <w:lvl w:ilvl="4" w:tplc="2C0A0003" w:tentative="1">
+      <w:start w:val="1"/>
+      <w:numFmt w:val="bullet"/>
+      <w:lvlText w:val="o"/>
+      <w:lvlJc w:val="left"/>
+      <w:pPr>
+        <w:ind w:left="4320" w:hanging="360"/>
+      </w:pPr>
+      <w:rPr>
+        <w:rFonts w:ascii="Courier New" w:hAnsi="Courier New" w:cs="Courier New" w:hint="default"/>
+      </w:rPr>
+    </w:lvl>
+    <w:lvl w:ilvl="5" w:tplc="2C0A0005" w:tentative="1">
+      <w:start w:val="1"/>
+      <w:numFmt w:val="bullet"/>
+      <w:lvlText w:val=""/>
+      <w:lvlJc w:val="left"/>
+      <w:pPr>
+        <w:ind w:left="5040" w:hanging="360"/>
+      </w:pPr>
+      <w:rPr>
+        <w:rFonts w:ascii="Wingdings" w:hAnsi="Wingdings" w:hint="default"/>
+      </w:rPr>
+    </w:lvl>
+    <w:lvl w:ilvl="6" w:tplc="2C0A0001" w:tentative="1">
+      <w:start w:val="1"/>
+      <w:numFmt w:val="bullet"/>
+      <w:lvlText w:val=""/>
+      <w:lvlJc w:val="left"/>
+      <w:pPr>
+        <w:ind w:left="5760" w:hanging="360"/>
+      </w:pPr>
+      <w:rPr>
+        <w:rFonts w:ascii="Symbol" w:hAnsi="Symbol" w:hint="default"/>
+      </w:rPr>
+    </w:lvl>
+    <w:lvl w:ilvl="7" w:tplc="2C0A0003" w:tentative="1">
+      <w:start w:val="1"/>
+      <w:numFmt w:val="bullet"/>
+      <w:lvlText w:val="o"/>
+      <w:lvlJc w:val="left"/>
+      <w:pPr>
+        <w:ind w:left="6480" w:hanging="360"/>
+      </w:pPr>
+      <w:rPr>
+        <w:rFonts w:ascii="Courier New" w:hAnsi="Courier New" w:cs="Courier New" w:hint="default"/>
+      </w:rPr>
+    </w:lvl>
+    <w:lvl w:ilvl="8" w:tplc="2C0A0005" w:tentative="1">
+      <w:start w:val="1"/>
+      <w:numFmt w:val="bullet"/>
+      <w:lvlText w:val=""/>
+      <w:lvlJc w:val="left"/>
+      <w:pPr>
+        <w:ind w:left="7200" w:hanging="360"/>
+      </w:pPr>
+      <w:rPr>
+        <w:rFonts w:ascii="Wingdings" w:hAnsi="Wingdings" w:hint="default"/>
+      </w:rPr>
+    </w:lvl>
+  </w:abstractNum>
+  <w:abstractNum w:abstractNumId="8" w15:restartNumberingAfterBreak="0">
+    <w:nsid w:val="3CFD7185"/>
+    <w:multiLevelType w:val="hybridMultilevel"/>
+    <w:tmpl w:val="69E8432E"/>
+    <w:lvl w:ilvl="0" w:tplc="2C0A0001">
+      <w:start w:val="1"/>
+      <w:numFmt w:val="bullet"/>
+      <w:lvlText w:val=""/>
+      <w:lvlJc w:val="left"/>
+      <w:pPr>
+        <w:ind w:left="720" w:hanging="360"/>
+      </w:pPr>
+      <w:rPr>
+        <w:rFonts w:ascii="Symbol" w:hAnsi="Symbol" w:hint="default"/>
+      </w:rPr>
+    </w:lvl>
+    <w:lvl w:ilvl="1" w:tplc="2C0A0003">
+      <w:start w:val="1"/>
+      <w:numFmt w:val="bullet"/>
+      <w:lvlText w:val="o"/>
+      <w:lvlJc w:val="left"/>
+      <w:pPr>
+        <w:ind w:left="1440" w:hanging="360"/>
+      </w:pPr>
+      <w:rPr>
+        <w:rFonts w:ascii="Courier New" w:hAnsi="Courier New" w:cs="Courier New" w:hint="default"/>
+      </w:rPr>
+    </w:lvl>
+    <w:lvl w:ilvl="2" w:tplc="2C0A0005">
+      <w:start w:val="1"/>
+      <w:numFmt w:val="bullet"/>
+      <w:lvlText w:val=""/>
+      <w:lvlJc w:val="left"/>
+      <w:pPr>
+        <w:ind w:left="2160" w:hanging="360"/>
+      </w:pPr>
+      <w:rPr>
+        <w:rFonts w:ascii="Wingdings" w:hAnsi="Wingdings" w:hint="default"/>
+      </w:rPr>
+    </w:lvl>
+    <w:lvl w:ilvl="3" w:tplc="2C0A0001" w:tentative="1">
+      <w:start w:val="1"/>
+      <w:numFmt w:val="bullet"/>
+      <w:lvlText w:val=""/>
+      <w:lvlJc w:val="left"/>
+      <w:pPr>
+        <w:ind w:left="2880" w:hanging="360"/>
+      </w:pPr>
+      <w:rPr>
+        <w:rFonts w:ascii="Symbol" w:hAnsi="Symbol" w:hint="default"/>
+      </w:rPr>
+    </w:lvl>
+    <w:lvl w:ilvl="4" w:tplc="2C0A0003" w:tentative="1">
+      <w:start w:val="1"/>
+      <w:numFmt w:val="bullet"/>
+      <w:lvlText w:val="o"/>
+      <w:lvlJc w:val="left"/>
+      <w:pPr>
+        <w:ind w:left="3600" w:hanging="360"/>
+      </w:pPr>
+      <w:rPr>
+        <w:rFonts w:ascii="Courier New" w:hAnsi="Courier New" w:cs="Courier New" w:hint="default"/>
+      </w:rPr>
+    </w:lvl>
+    <w:lvl w:ilvl="5" w:tplc="2C0A0005" w:tentative="1">
+      <w:start w:val="1"/>
+      <w:numFmt w:val="bullet"/>
+      <w:lvlText w:val=""/>
+      <w:lvlJc w:val="left"/>
+      <w:pPr>
+        <w:ind w:left="4320" w:hanging="360"/>
+      </w:pPr>
+      <w:rPr>
+        <w:rFonts w:ascii="Wingdings" w:hAnsi="Wingdings" w:hint="default"/>
+      </w:rPr>
+    </w:lvl>
+    <w:lvl w:ilvl="6" w:tplc="2C0A0001" w:tentative="1">
+      <w:start w:val="1"/>
+      <w:numFmt w:val="bullet"/>
+      <w:lvlText w:val=""/>
+      <w:lvlJc w:val="left"/>
+      <w:pPr>
+        <w:ind w:left="5040" w:hanging="360"/>
+      </w:pPr>
+      <w:rPr>
+        <w:rFonts w:ascii="Symbol" w:hAnsi="Symbol" w:hint="default"/>
+      </w:rPr>
+    </w:lvl>
+    <w:lvl w:ilvl="7" w:tplc="2C0A0003" w:tentative="1">
+      <w:start w:val="1"/>
+      <w:numFmt w:val="bullet"/>
+      <w:lvlText w:val="o"/>
+      <w:lvlJc w:val="left"/>
+      <w:pPr>
+        <w:ind w:left="5760" w:hanging="360"/>
+      </w:pPr>
+      <w:rPr>
+        <w:rFonts w:ascii="Courier New" w:hAnsi="Courier New" w:cs="Courier New" w:hint="default"/>
+      </w:rPr>
+    </w:lvl>
+    <w:lvl w:ilvl="8" w:tplc="2C0A0005" w:tentative="1">
+      <w:start w:val="1"/>
+      <w:numFmt w:val="bullet"/>
+      <w:lvlText w:val=""/>
+      <w:lvlJc w:val="left"/>
+      <w:pPr>
+        <w:ind w:left="6480" w:hanging="360"/>
+      </w:pPr>
+      <w:rPr>
+        <w:rFonts w:ascii="Wingdings" w:hAnsi="Wingdings" w:hint="default"/>
+      </w:rPr>
+    </w:lvl>
+  </w:abstractNum>
+  <w:abstractNum w:abstractNumId="9" w15:restartNumberingAfterBreak="0">
     <w:nsid w:val="49BC0010"/>
     <w:multiLevelType w:val="multilevel"/>
     <w:tmpl w:val="06A8B1BA"/>
@@ -8308,7 +11655,93 @@
       </w:rPr>
     </w:lvl>
   </w:abstractNum>
-  <w:abstractNum w:abstractNumId="3" w15:restartNumberingAfterBreak="0">
+  <w:abstractNum w:abstractNumId="10" w15:restartNumberingAfterBreak="0">
+    <w:nsid w:val="4D323D19"/>
+    <w:multiLevelType w:val="hybridMultilevel"/>
+    <w:tmpl w:val="33CA2B98"/>
+    <w:lvl w:ilvl="0" w:tplc="FFFFFFFF">
+      <w:start w:val="1"/>
+      <w:numFmt w:val="decimal"/>
+      <w:lvlText w:val="%1."/>
+      <w:lvlJc w:val="left"/>
+      <w:pPr>
+        <w:ind w:left="720" w:hanging="360"/>
+      </w:pPr>
+    </w:lvl>
+    <w:lvl w:ilvl="1" w:tplc="FFFFFFFF" w:tentative="1">
+      <w:start w:val="1"/>
+      <w:numFmt w:val="lowerLetter"/>
+      <w:lvlText w:val="%2."/>
+      <w:lvlJc w:val="left"/>
+      <w:pPr>
+        <w:ind w:left="1440" w:hanging="360"/>
+      </w:pPr>
+    </w:lvl>
+    <w:lvl w:ilvl="2" w:tplc="FFFFFFFF" w:tentative="1">
+      <w:start w:val="1"/>
+      <w:numFmt w:val="lowerRoman"/>
+      <w:lvlText w:val="%3."/>
+      <w:lvlJc w:val="right"/>
+      <w:pPr>
+        <w:ind w:left="2160" w:hanging="180"/>
+      </w:pPr>
+    </w:lvl>
+    <w:lvl w:ilvl="3" w:tplc="FFFFFFFF" w:tentative="1">
+      <w:start w:val="1"/>
+      <w:numFmt w:val="decimal"/>
+      <w:lvlText w:val="%4."/>
+      <w:lvlJc w:val="left"/>
+      <w:pPr>
+        <w:ind w:left="2880" w:hanging="360"/>
+      </w:pPr>
+    </w:lvl>
+    <w:lvl w:ilvl="4" w:tplc="FFFFFFFF" w:tentative="1">
+      <w:start w:val="1"/>
+      <w:numFmt w:val="lowerLetter"/>
+      <w:lvlText w:val="%5."/>
+      <w:lvlJc w:val="left"/>
+      <w:pPr>
+        <w:ind w:left="3600" w:hanging="360"/>
+      </w:pPr>
+    </w:lvl>
+    <w:lvl w:ilvl="5" w:tplc="FFFFFFFF" w:tentative="1">
+      <w:start w:val="1"/>
+      <w:numFmt w:val="lowerRoman"/>
+      <w:lvlText w:val="%6."/>
+      <w:lvlJc w:val="right"/>
+      <w:pPr>
+        <w:ind w:left="4320" w:hanging="180"/>
+      </w:pPr>
+    </w:lvl>
+    <w:lvl w:ilvl="6" w:tplc="FFFFFFFF" w:tentative="1">
+      <w:start w:val="1"/>
+      <w:numFmt w:val="decimal"/>
+      <w:lvlText w:val="%7."/>
+      <w:lvlJc w:val="left"/>
+      <w:pPr>
+        <w:ind w:left="5040" w:hanging="360"/>
+      </w:pPr>
+    </w:lvl>
+    <w:lvl w:ilvl="7" w:tplc="FFFFFFFF" w:tentative="1">
+      <w:start w:val="1"/>
+      <w:numFmt w:val="lowerLetter"/>
+      <w:lvlText w:val="%8."/>
+      <w:lvlJc w:val="left"/>
+      <w:pPr>
+        <w:ind w:left="5760" w:hanging="360"/>
+      </w:pPr>
+    </w:lvl>
+    <w:lvl w:ilvl="8" w:tplc="FFFFFFFF" w:tentative="1">
+      <w:start w:val="1"/>
+      <w:numFmt w:val="lowerRoman"/>
+      <w:lvlText w:val="%9."/>
+      <w:lvlJc w:val="right"/>
+      <w:pPr>
+        <w:ind w:left="6480" w:hanging="180"/>
+      </w:pPr>
+    </w:lvl>
+  </w:abstractNum>
+  <w:abstractNum w:abstractNumId="11" w15:restartNumberingAfterBreak="0">
     <w:nsid w:val="50173750"/>
     <w:multiLevelType w:val="hybridMultilevel"/>
     <w:tmpl w:val="840C4908"/>
@@ -8441,7 +11874,120 @@
       </w:rPr>
     </w:lvl>
   </w:abstractNum>
-  <w:abstractNum w:abstractNumId="4" w15:restartNumberingAfterBreak="0">
+  <w:abstractNum w:abstractNumId="12" w15:restartNumberingAfterBreak="0">
+    <w:nsid w:val="52C461CF"/>
+    <w:multiLevelType w:val="hybridMultilevel"/>
+    <w:tmpl w:val="39583822"/>
+    <w:lvl w:ilvl="0" w:tplc="2C0A0001">
+      <w:start w:val="1"/>
+      <w:numFmt w:val="bullet"/>
+      <w:lvlText w:val=""/>
+      <w:lvlJc w:val="left"/>
+      <w:pPr>
+        <w:ind w:left="720" w:hanging="360"/>
+      </w:pPr>
+      <w:rPr>
+        <w:rFonts w:ascii="Symbol" w:hAnsi="Symbol" w:hint="default"/>
+      </w:rPr>
+    </w:lvl>
+    <w:lvl w:ilvl="1" w:tplc="2C0A0003" w:tentative="1">
+      <w:start w:val="1"/>
+      <w:numFmt w:val="bullet"/>
+      <w:lvlText w:val="o"/>
+      <w:lvlJc w:val="left"/>
+      <w:pPr>
+        <w:ind w:left="1440" w:hanging="360"/>
+      </w:pPr>
+      <w:rPr>
+        <w:rFonts w:ascii="Courier New" w:hAnsi="Courier New" w:cs="Courier New" w:hint="default"/>
+      </w:rPr>
+    </w:lvl>
+    <w:lvl w:ilvl="2" w:tplc="2C0A0005" w:tentative="1">
+      <w:start w:val="1"/>
+      <w:numFmt w:val="bullet"/>
+      <w:lvlText w:val=""/>
+      <w:lvlJc w:val="left"/>
+      <w:pPr>
+        <w:ind w:left="2160" w:hanging="360"/>
+      </w:pPr>
+      <w:rPr>
+        <w:rFonts w:ascii="Wingdings" w:hAnsi="Wingdings" w:hint="default"/>
+      </w:rPr>
+    </w:lvl>
+    <w:lvl w:ilvl="3" w:tplc="2C0A0001" w:tentative="1">
+      <w:start w:val="1"/>
+      <w:numFmt w:val="bullet"/>
+      <w:lvlText w:val=""/>
+      <w:lvlJc w:val="left"/>
+      <w:pPr>
+        <w:ind w:left="2880" w:hanging="360"/>
+      </w:pPr>
+      <w:rPr>
+        <w:rFonts w:ascii="Symbol" w:hAnsi="Symbol" w:hint="default"/>
+      </w:rPr>
+    </w:lvl>
+    <w:lvl w:ilvl="4" w:tplc="2C0A0003" w:tentative="1">
+      <w:start w:val="1"/>
+      <w:numFmt w:val="bullet"/>
+      <w:lvlText w:val="o"/>
+      <w:lvlJc w:val="left"/>
+      <w:pPr>
+        <w:ind w:left="3600" w:hanging="360"/>
+      </w:pPr>
+      <w:rPr>
+        <w:rFonts w:ascii="Courier New" w:hAnsi="Courier New" w:cs="Courier New" w:hint="default"/>
+      </w:rPr>
+    </w:lvl>
+    <w:lvl w:ilvl="5" w:tplc="2C0A0005" w:tentative="1">
+      <w:start w:val="1"/>
+      <w:numFmt w:val="bullet"/>
+      <w:lvlText w:val=""/>
+      <w:lvlJc w:val="left"/>
+      <w:pPr>
+        <w:ind w:left="4320" w:hanging="360"/>
+      </w:pPr>
+      <w:rPr>
+        <w:rFonts w:ascii="Wingdings" w:hAnsi="Wingdings" w:hint="default"/>
+      </w:rPr>
+    </w:lvl>
+    <w:lvl w:ilvl="6" w:tplc="2C0A0001" w:tentative="1">
+      <w:start w:val="1"/>
+      <w:numFmt w:val="bullet"/>
+      <w:lvlText w:val=""/>
+      <w:lvlJc w:val="left"/>
+      <w:pPr>
+        <w:ind w:left="5040" w:hanging="360"/>
+      </w:pPr>
+      <w:rPr>
+        <w:rFonts w:ascii="Symbol" w:hAnsi="Symbol" w:hint="default"/>
+      </w:rPr>
+    </w:lvl>
+    <w:lvl w:ilvl="7" w:tplc="2C0A0003" w:tentative="1">
+      <w:start w:val="1"/>
+      <w:numFmt w:val="bullet"/>
+      <w:lvlText w:val="o"/>
+      <w:lvlJc w:val="left"/>
+      <w:pPr>
+        <w:ind w:left="5760" w:hanging="360"/>
+      </w:pPr>
+      <w:rPr>
+        <w:rFonts w:ascii="Courier New" w:hAnsi="Courier New" w:cs="Courier New" w:hint="default"/>
+      </w:rPr>
+    </w:lvl>
+    <w:lvl w:ilvl="8" w:tplc="2C0A0005" w:tentative="1">
+      <w:start w:val="1"/>
+      <w:numFmt w:val="bullet"/>
+      <w:lvlText w:val=""/>
+      <w:lvlJc w:val="left"/>
+      <w:pPr>
+        <w:ind w:left="6480" w:hanging="360"/>
+      </w:pPr>
+      <w:rPr>
+        <w:rFonts w:ascii="Wingdings" w:hAnsi="Wingdings" w:hint="default"/>
+      </w:rPr>
+    </w:lvl>
+  </w:abstractNum>
+  <w:abstractNum w:abstractNumId="13" w15:restartNumberingAfterBreak="0">
     <w:nsid w:val="59F963D5"/>
     <w:multiLevelType w:val="multilevel"/>
     <w:tmpl w:val="3ABCCAB8"/>
@@ -8590,7 +12136,7 @@
       </w:rPr>
     </w:lvl>
   </w:abstractNum>
-  <w:abstractNum w:abstractNumId="5" w15:restartNumberingAfterBreak="0">
+  <w:abstractNum w:abstractNumId="14" w15:restartNumberingAfterBreak="0">
     <w:nsid w:val="624C5B3E"/>
     <w:multiLevelType w:val="multilevel"/>
     <w:tmpl w:val="46049858"/>
@@ -8739,7 +12285,7 @@
       </w:rPr>
     </w:lvl>
   </w:abstractNum>
-  <w:abstractNum w:abstractNumId="6" w15:restartNumberingAfterBreak="0">
+  <w:abstractNum w:abstractNumId="15" w15:restartNumberingAfterBreak="0">
     <w:nsid w:val="661A3CDB"/>
     <w:multiLevelType w:val="multilevel"/>
     <w:tmpl w:val="B93A5622"/>
@@ -8888,7 +12434,93 @@
       </w:rPr>
     </w:lvl>
   </w:abstractNum>
-  <w:abstractNum w:abstractNumId="7" w15:restartNumberingAfterBreak="0">
+  <w:abstractNum w:abstractNumId="16" w15:restartNumberingAfterBreak="0">
+    <w:nsid w:val="730C7504"/>
+    <w:multiLevelType w:val="hybridMultilevel"/>
+    <w:tmpl w:val="88824E56"/>
+    <w:lvl w:ilvl="0" w:tplc="FFFFFFFF">
+      <w:start w:val="1"/>
+      <w:numFmt w:val="decimal"/>
+      <w:lvlText w:val="%1."/>
+      <w:lvlJc w:val="left"/>
+      <w:pPr>
+        <w:ind w:left="720" w:hanging="360"/>
+      </w:pPr>
+    </w:lvl>
+    <w:lvl w:ilvl="1" w:tplc="FFFFFFFF" w:tentative="1">
+      <w:start w:val="1"/>
+      <w:numFmt w:val="lowerLetter"/>
+      <w:lvlText w:val="%2."/>
+      <w:lvlJc w:val="left"/>
+      <w:pPr>
+        <w:ind w:left="1440" w:hanging="360"/>
+      </w:pPr>
+    </w:lvl>
+    <w:lvl w:ilvl="2" w:tplc="FFFFFFFF" w:tentative="1">
+      <w:start w:val="1"/>
+      <w:numFmt w:val="lowerRoman"/>
+      <w:lvlText w:val="%3."/>
+      <w:lvlJc w:val="right"/>
+      <w:pPr>
+        <w:ind w:left="2160" w:hanging="180"/>
+      </w:pPr>
+    </w:lvl>
+    <w:lvl w:ilvl="3" w:tplc="FFFFFFFF" w:tentative="1">
+      <w:start w:val="1"/>
+      <w:numFmt w:val="decimal"/>
+      <w:lvlText w:val="%4."/>
+      <w:lvlJc w:val="left"/>
+      <w:pPr>
+        <w:ind w:left="2880" w:hanging="360"/>
+      </w:pPr>
+    </w:lvl>
+    <w:lvl w:ilvl="4" w:tplc="FFFFFFFF" w:tentative="1">
+      <w:start w:val="1"/>
+      <w:numFmt w:val="lowerLetter"/>
+      <w:lvlText w:val="%5."/>
+      <w:lvlJc w:val="left"/>
+      <w:pPr>
+        <w:ind w:left="3600" w:hanging="360"/>
+      </w:pPr>
+    </w:lvl>
+    <w:lvl w:ilvl="5" w:tplc="FFFFFFFF" w:tentative="1">
+      <w:start w:val="1"/>
+      <w:numFmt w:val="lowerRoman"/>
+      <w:lvlText w:val="%6."/>
+      <w:lvlJc w:val="right"/>
+      <w:pPr>
+        <w:ind w:left="4320" w:hanging="180"/>
+      </w:pPr>
+    </w:lvl>
+    <w:lvl w:ilvl="6" w:tplc="FFFFFFFF" w:tentative="1">
+      <w:start w:val="1"/>
+      <w:numFmt w:val="decimal"/>
+      <w:lvlText w:val="%7."/>
+      <w:lvlJc w:val="left"/>
+      <w:pPr>
+        <w:ind w:left="5040" w:hanging="360"/>
+      </w:pPr>
+    </w:lvl>
+    <w:lvl w:ilvl="7" w:tplc="FFFFFFFF" w:tentative="1">
+      <w:start w:val="1"/>
+      <w:numFmt w:val="lowerLetter"/>
+      <w:lvlText w:val="%8."/>
+      <w:lvlJc w:val="left"/>
+      <w:pPr>
+        <w:ind w:left="5760" w:hanging="360"/>
+      </w:pPr>
+    </w:lvl>
+    <w:lvl w:ilvl="8" w:tplc="FFFFFFFF" w:tentative="1">
+      <w:start w:val="1"/>
+      <w:numFmt w:val="lowerRoman"/>
+      <w:lvlText w:val="%9."/>
+      <w:lvlJc w:val="right"/>
+      <w:pPr>
+        <w:ind w:left="6480" w:hanging="180"/>
+      </w:pPr>
+    </w:lvl>
+  </w:abstractNum>
+  <w:abstractNum w:abstractNumId="17" w15:restartNumberingAfterBreak="0">
     <w:nsid w:val="7ADD42EC"/>
     <w:multiLevelType w:val="multilevel"/>
     <w:tmpl w:val="43462E54"/>
@@ -9037,7 +12669,156 @@
       </w:rPr>
     </w:lvl>
   </w:abstractNum>
-  <w:abstractNum w:abstractNumId="8" w15:restartNumberingAfterBreak="0">
+  <w:abstractNum w:abstractNumId="18" w15:restartNumberingAfterBreak="0">
+    <w:nsid w:val="7C5E7C8F"/>
+    <w:multiLevelType w:val="multilevel"/>
+    <w:tmpl w:val="BE6E2B80"/>
+    <w:lvl w:ilvl="0">
+      <w:start w:val="1"/>
+      <w:numFmt w:val="bullet"/>
+      <w:lvlText w:val=""/>
+      <w:lvlJc w:val="left"/>
+      <w:pPr>
+        <w:tabs>
+          <w:tab w:val="num" w:pos="720"/>
+        </w:tabs>
+        <w:ind w:left="720" w:hanging="360"/>
+      </w:pPr>
+      <w:rPr>
+        <w:rFonts w:ascii="Symbol" w:hAnsi="Symbol" w:hint="default"/>
+        <w:sz w:val="20"/>
+      </w:rPr>
+    </w:lvl>
+    <w:lvl w:ilvl="1" w:tentative="1">
+      <w:start w:val="1"/>
+      <w:numFmt w:val="bullet"/>
+      <w:lvlText w:val="o"/>
+      <w:lvlJc w:val="left"/>
+      <w:pPr>
+        <w:tabs>
+          <w:tab w:val="num" w:pos="1440"/>
+        </w:tabs>
+        <w:ind w:left="1440" w:hanging="360"/>
+      </w:pPr>
+      <w:rPr>
+        <w:rFonts w:ascii="Courier New" w:hAnsi="Courier New" w:hint="default"/>
+        <w:sz w:val="20"/>
+      </w:rPr>
+    </w:lvl>
+    <w:lvl w:ilvl="2" w:tentative="1">
+      <w:start w:val="1"/>
+      <w:numFmt w:val="bullet"/>
+      <w:lvlText w:val=""/>
+      <w:lvlJc w:val="left"/>
+      <w:pPr>
+        <w:tabs>
+          <w:tab w:val="num" w:pos="2160"/>
+        </w:tabs>
+        <w:ind w:left="2160" w:hanging="360"/>
+      </w:pPr>
+      <w:rPr>
+        <w:rFonts w:ascii="Wingdings" w:hAnsi="Wingdings" w:hint="default"/>
+        <w:sz w:val="20"/>
+      </w:rPr>
+    </w:lvl>
+    <w:lvl w:ilvl="3" w:tentative="1">
+      <w:start w:val="1"/>
+      <w:numFmt w:val="bullet"/>
+      <w:lvlText w:val=""/>
+      <w:lvlJc w:val="left"/>
+      <w:pPr>
+        <w:tabs>
+          <w:tab w:val="num" w:pos="2880"/>
+        </w:tabs>
+        <w:ind w:left="2880" w:hanging="360"/>
+      </w:pPr>
+      <w:rPr>
+        <w:rFonts w:ascii="Wingdings" w:hAnsi="Wingdings" w:hint="default"/>
+        <w:sz w:val="20"/>
+      </w:rPr>
+    </w:lvl>
+    <w:lvl w:ilvl="4" w:tentative="1">
+      <w:start w:val="1"/>
+      <w:numFmt w:val="bullet"/>
+      <w:lvlText w:val=""/>
+      <w:lvlJc w:val="left"/>
+      <w:pPr>
+        <w:tabs>
+          <w:tab w:val="num" w:pos="3600"/>
+        </w:tabs>
+        <w:ind w:left="3600" w:hanging="360"/>
+      </w:pPr>
+      <w:rPr>
+        <w:rFonts w:ascii="Wingdings" w:hAnsi="Wingdings" w:hint="default"/>
+        <w:sz w:val="20"/>
+      </w:rPr>
+    </w:lvl>
+    <w:lvl w:ilvl="5" w:tentative="1">
+      <w:start w:val="1"/>
+      <w:numFmt w:val="bullet"/>
+      <w:lvlText w:val=""/>
+      <w:lvlJc w:val="left"/>
+      <w:pPr>
+        <w:tabs>
+          <w:tab w:val="num" w:pos="4320"/>
+        </w:tabs>
+        <w:ind w:left="4320" w:hanging="360"/>
+      </w:pPr>
+      <w:rPr>
+        <w:rFonts w:ascii="Wingdings" w:hAnsi="Wingdings" w:hint="default"/>
+        <w:sz w:val="20"/>
+      </w:rPr>
+    </w:lvl>
+    <w:lvl w:ilvl="6" w:tentative="1">
+      <w:start w:val="1"/>
+      <w:numFmt w:val="bullet"/>
+      <w:lvlText w:val=""/>
+      <w:lvlJc w:val="left"/>
+      <w:pPr>
+        <w:tabs>
+          <w:tab w:val="num" w:pos="5040"/>
+        </w:tabs>
+        <w:ind w:left="5040" w:hanging="360"/>
+      </w:pPr>
+      <w:rPr>
+        <w:rFonts w:ascii="Wingdings" w:hAnsi="Wingdings" w:hint="default"/>
+        <w:sz w:val="20"/>
+      </w:rPr>
+    </w:lvl>
+    <w:lvl w:ilvl="7" w:tentative="1">
+      <w:start w:val="1"/>
+      <w:numFmt w:val="bullet"/>
+      <w:lvlText w:val=""/>
+      <w:lvlJc w:val="left"/>
+      <w:pPr>
+        <w:tabs>
+          <w:tab w:val="num" w:pos="5760"/>
+        </w:tabs>
+        <w:ind w:left="5760" w:hanging="360"/>
+      </w:pPr>
+      <w:rPr>
+        <w:rFonts w:ascii="Wingdings" w:hAnsi="Wingdings" w:hint="default"/>
+        <w:sz w:val="20"/>
+      </w:rPr>
+    </w:lvl>
+    <w:lvl w:ilvl="8" w:tentative="1">
+      <w:start w:val="1"/>
+      <w:numFmt w:val="bullet"/>
+      <w:lvlText w:val=""/>
+      <w:lvlJc w:val="left"/>
+      <w:pPr>
+        <w:tabs>
+          <w:tab w:val="num" w:pos="6480"/>
+        </w:tabs>
+        <w:ind w:left="6480" w:hanging="360"/>
+      </w:pPr>
+      <w:rPr>
+        <w:rFonts w:ascii="Wingdings" w:hAnsi="Wingdings" w:hint="default"/>
+        <w:sz w:val="20"/>
+      </w:rPr>
+    </w:lvl>
+  </w:abstractNum>
+  <w:abstractNum w:abstractNumId="19" w15:restartNumberingAfterBreak="0">
     <w:nsid w:val="7D3821AD"/>
     <w:multiLevelType w:val="multilevel"/>
     <w:tmpl w:val="60087A50"/>
@@ -9187,31 +12968,64 @@
     </w:lvl>
   </w:abstractNum>
   <w:num w:numId="1">
+    <w:abstractNumId w:val="5"/>
+  </w:num>
+  <w:num w:numId="2">
+    <w:abstractNumId w:val="11"/>
+  </w:num>
+  <w:num w:numId="3">
+    <w:abstractNumId w:val="19"/>
+  </w:num>
+  <w:num w:numId="4">
+    <w:abstractNumId w:val="17"/>
+  </w:num>
+  <w:num w:numId="5">
+    <w:abstractNumId w:val="9"/>
+  </w:num>
+  <w:num w:numId="6">
+    <w:abstractNumId w:val="14"/>
+  </w:num>
+  <w:num w:numId="7">
+    <w:abstractNumId w:val="2"/>
+  </w:num>
+  <w:num w:numId="8">
+    <w:abstractNumId w:val="15"/>
+  </w:num>
+  <w:num w:numId="9">
+    <w:abstractNumId w:val="13"/>
+  </w:num>
+  <w:num w:numId="10">
     <w:abstractNumId w:val="1"/>
   </w:num>
-  <w:num w:numId="2">
+  <w:num w:numId="11">
     <w:abstractNumId w:val="3"/>
   </w:num>
-  <w:num w:numId="3">
+  <w:num w:numId="12">
+    <w:abstractNumId w:val="12"/>
+  </w:num>
+  <w:num w:numId="13">
+    <w:abstractNumId w:val="10"/>
+  </w:num>
+  <w:num w:numId="14">
+    <w:abstractNumId w:val="16"/>
+  </w:num>
+  <w:num w:numId="15">
+    <w:abstractNumId w:val="0"/>
+  </w:num>
+  <w:num w:numId="16">
     <w:abstractNumId w:val="8"/>
   </w:num>
-  <w:num w:numId="4">
+  <w:num w:numId="17">
     <w:abstractNumId w:val="7"/>
   </w:num>
-  <w:num w:numId="5">
-    <w:abstractNumId w:val="2"/>
-  </w:num>
-  <w:num w:numId="6">
-    <w:abstractNumId w:val="5"/>
-  </w:num>
-  <w:num w:numId="7">
-    <w:abstractNumId w:val="0"/>
-  </w:num>
-  <w:num w:numId="8">
+  <w:num w:numId="18">
     <w:abstractNumId w:val="6"/>
   </w:num>
-  <w:num w:numId="9">
+  <w:num w:numId="19">
     <w:abstractNumId w:val="4"/>
+  </w:num>
+  <w:num w:numId="20">
+    <w:abstractNumId w:val="18"/>
   </w:num>
 </w:numbering>
 </file>
@@ -9621,6 +13435,35 @@
       <w:lang w:val="es-ES"/>
     </w:rPr>
   </w:style>
+  <w:style w:type="paragraph" w:styleId="Ttulo3">
+    <w:name w:val="heading 3"/>
+    <w:basedOn w:val="Normal"/>
+    <w:next w:val="Normal"/>
+    <w:link w:val="Ttulo3Car"/>
+    <w:uiPriority w:val="9"/>
+    <w:semiHidden/>
+    <w:unhideWhenUsed/>
+    <w:qFormat/>
+    <w:rsid w:val="00E1406E"/>
+    <w:pPr>
+      <w:keepNext/>
+      <w:keepLines/>
+      <w:widowControl/>
+      <w:autoSpaceDE/>
+      <w:autoSpaceDN/>
+      <w:spacing w:before="160" w:after="80" w:line="278" w:lineRule="auto"/>
+      <w:outlineLvl w:val="2"/>
+    </w:pPr>
+    <w:rPr>
+      <w:rFonts w:asciiTheme="minorHAnsi" w:eastAsiaTheme="majorEastAsia" w:hAnsiTheme="minorHAnsi" w:cstheme="majorBidi"/>
+      <w:color w:val="365F91" w:themeColor="accent1" w:themeShade="BF"/>
+      <w:kern w:val="2"/>
+      <w:sz w:val="28"/>
+      <w:szCs w:val="28"/>
+      <w:lang w:val="es-AR"/>
+      <w14:ligatures w14:val="standardContextual"/>
+    </w:rPr>
+  </w:style>
   <w:style w:type="character" w:default="1" w:styleId="Fuentedeprrafopredeter">
     <w:name w:val="Default Paragraph Font"/>
     <w:uiPriority w:val="1"/>
@@ -9673,7 +13516,7 @@
   <w:style w:type="paragraph" w:styleId="Prrafodelista">
     <w:name w:val="List Paragraph"/>
     <w:basedOn w:val="Normal"/>
-    <w:uiPriority w:val="1"/>
+    <w:uiPriority w:val="34"/>
     <w:qFormat/>
     <w:pPr>
       <w:ind w:left="994" w:hanging="404"/>
@@ -9760,6 +13603,209 @@
     <w:name w:val="mbin"/>
     <w:basedOn w:val="Fuentedeprrafopredeter"/>
     <w:rsid w:val="001F5985"/>
+  </w:style>
+  <w:style w:type="paragraph" w:styleId="Subttulo">
+    <w:name w:val="Subtitle"/>
+    <w:basedOn w:val="Normal"/>
+    <w:next w:val="Normal"/>
+    <w:link w:val="SubttuloCar"/>
+    <w:uiPriority w:val="11"/>
+    <w:qFormat/>
+    <w:rsid w:val="00E1406E"/>
+    <w:pPr>
+      <w:widowControl/>
+      <w:numPr>
+        <w:ilvl w:val="1"/>
+      </w:numPr>
+      <w:autoSpaceDE/>
+      <w:autoSpaceDN/>
+      <w:spacing w:after="160" w:line="278" w:lineRule="auto"/>
+    </w:pPr>
+    <w:rPr>
+      <w:rFonts w:asciiTheme="minorHAnsi" w:eastAsiaTheme="majorEastAsia" w:hAnsiTheme="minorHAnsi" w:cstheme="majorBidi"/>
+      <w:color w:val="595959" w:themeColor="text1" w:themeTint="A6"/>
+      <w:spacing w:val="15"/>
+      <w:kern w:val="2"/>
+      <w:sz w:val="28"/>
+      <w:szCs w:val="28"/>
+      <w:lang w:val="es-AR"/>
+      <w14:ligatures w14:val="standardContextual"/>
+    </w:rPr>
+  </w:style>
+  <w:style w:type="character" w:customStyle="1" w:styleId="SubttuloCar">
+    <w:name w:val="Subtítulo Car"/>
+    <w:basedOn w:val="Fuentedeprrafopredeter"/>
+    <w:link w:val="Subttulo"/>
+    <w:uiPriority w:val="11"/>
+    <w:rsid w:val="00E1406E"/>
+    <w:rPr>
+      <w:rFonts w:eastAsiaTheme="majorEastAsia" w:cstheme="majorBidi"/>
+      <w:color w:val="595959" w:themeColor="text1" w:themeTint="A6"/>
+      <w:spacing w:val="15"/>
+      <w:kern w:val="2"/>
+      <w:sz w:val="28"/>
+      <w:szCs w:val="28"/>
+      <w:lang w:val="es-AR"/>
+      <w14:ligatures w14:val="standardContextual"/>
+    </w:rPr>
+  </w:style>
+  <w:style w:type="table" w:styleId="Tablanormal5">
+    <w:name w:val="Plain Table 5"/>
+    <w:basedOn w:val="Tablanormal"/>
+    <w:uiPriority w:val="45"/>
+    <w:rsid w:val="00E1406E"/>
+    <w:pPr>
+      <w:widowControl/>
+      <w:autoSpaceDE/>
+      <w:autoSpaceDN/>
+    </w:pPr>
+    <w:rPr>
+      <w:kern w:val="2"/>
+      <w:sz w:val="24"/>
+      <w:szCs w:val="24"/>
+      <w:lang w:val="es-AR"/>
+      <w14:ligatures w14:val="standardContextual"/>
+    </w:rPr>
+    <w:tblPr>
+      <w:tblStyleRowBandSize w:val="1"/>
+      <w:tblStyleColBandSize w:val="1"/>
+    </w:tblPr>
+    <w:tblStylePr w:type="firstRow">
+      <w:rPr>
+        <w:rFonts w:asciiTheme="majorHAnsi" w:eastAsiaTheme="majorEastAsia" w:hAnsiTheme="majorHAnsi" w:cstheme="majorBidi"/>
+        <w:i/>
+        <w:iCs/>
+        <w:sz w:val="26"/>
+      </w:rPr>
+      <w:tblPr/>
+      <w:tcPr>
+        <w:tcBorders>
+          <w:bottom w:val="single" w:sz="4" w:space="0" w:color="7F7F7F" w:themeColor="text1" w:themeTint="80"/>
+        </w:tcBorders>
+        <w:shd w:val="clear" w:color="auto" w:fill="FFFFFF" w:themeFill="background1"/>
+      </w:tcPr>
+    </w:tblStylePr>
+    <w:tblStylePr w:type="lastRow">
+      <w:rPr>
+        <w:rFonts w:asciiTheme="majorHAnsi" w:eastAsiaTheme="majorEastAsia" w:hAnsiTheme="majorHAnsi" w:cstheme="majorBidi"/>
+        <w:i/>
+        <w:iCs/>
+        <w:sz w:val="26"/>
+      </w:rPr>
+      <w:tblPr/>
+      <w:tcPr>
+        <w:tcBorders>
+          <w:top w:val="single" w:sz="4" w:space="0" w:color="7F7F7F" w:themeColor="text1" w:themeTint="80"/>
+        </w:tcBorders>
+        <w:shd w:val="clear" w:color="auto" w:fill="FFFFFF" w:themeFill="background1"/>
+      </w:tcPr>
+    </w:tblStylePr>
+    <w:tblStylePr w:type="firstCol">
+      <w:pPr>
+        <w:jc w:val="right"/>
+      </w:pPr>
+      <w:rPr>
+        <w:rFonts w:asciiTheme="majorHAnsi" w:eastAsiaTheme="majorEastAsia" w:hAnsiTheme="majorHAnsi" w:cstheme="majorBidi"/>
+        <w:i/>
+        <w:iCs/>
+        <w:sz w:val="26"/>
+      </w:rPr>
+      <w:tblPr/>
+      <w:tcPr>
+        <w:tcBorders>
+          <w:right w:val="single" w:sz="4" w:space="0" w:color="7F7F7F" w:themeColor="text1" w:themeTint="80"/>
+        </w:tcBorders>
+        <w:shd w:val="clear" w:color="auto" w:fill="FFFFFF" w:themeFill="background1"/>
+      </w:tcPr>
+    </w:tblStylePr>
+    <w:tblStylePr w:type="lastCol">
+      <w:rPr>
+        <w:rFonts w:asciiTheme="majorHAnsi" w:eastAsiaTheme="majorEastAsia" w:hAnsiTheme="majorHAnsi" w:cstheme="majorBidi"/>
+        <w:i/>
+        <w:iCs/>
+        <w:sz w:val="26"/>
+      </w:rPr>
+      <w:tblPr/>
+      <w:tcPr>
+        <w:tcBorders>
+          <w:left w:val="single" w:sz="4" w:space="0" w:color="7F7F7F" w:themeColor="text1" w:themeTint="80"/>
+        </w:tcBorders>
+        <w:shd w:val="clear" w:color="auto" w:fill="FFFFFF" w:themeFill="background1"/>
+      </w:tcPr>
+    </w:tblStylePr>
+    <w:tblStylePr w:type="band1Vert">
+      <w:tblPr/>
+      <w:tcPr>
+        <w:shd w:val="clear" w:color="auto" w:fill="F2F2F2" w:themeFill="background1" w:themeFillShade="F2"/>
+      </w:tcPr>
+    </w:tblStylePr>
+    <w:tblStylePr w:type="band1Horz">
+      <w:tblPr/>
+      <w:tcPr>
+        <w:shd w:val="clear" w:color="auto" w:fill="F2F2F2" w:themeFill="background1" w:themeFillShade="F2"/>
+      </w:tcPr>
+    </w:tblStylePr>
+    <w:tblStylePr w:type="neCell">
+      <w:tblPr/>
+      <w:tcPr>
+        <w:tcBorders>
+          <w:left w:val="nil"/>
+        </w:tcBorders>
+      </w:tcPr>
+    </w:tblStylePr>
+    <w:tblStylePr w:type="nwCell">
+      <w:tblPr/>
+      <w:tcPr>
+        <w:tcBorders>
+          <w:right w:val="nil"/>
+        </w:tcBorders>
+      </w:tcPr>
+    </w:tblStylePr>
+    <w:tblStylePr w:type="seCell">
+      <w:tblPr/>
+      <w:tcPr>
+        <w:tcBorders>
+          <w:left w:val="nil"/>
+        </w:tcBorders>
+      </w:tcPr>
+    </w:tblStylePr>
+    <w:tblStylePr w:type="swCell">
+      <w:tblPr/>
+      <w:tcPr>
+        <w:tcBorders>
+          <w:right w:val="nil"/>
+        </w:tcBorders>
+      </w:tcPr>
+    </w:tblStylePr>
+  </w:style>
+  <w:style w:type="character" w:styleId="nfasissutil">
+    <w:name w:val="Subtle Emphasis"/>
+    <w:basedOn w:val="Fuentedeprrafopredeter"/>
+    <w:uiPriority w:val="19"/>
+    <w:qFormat/>
+    <w:rsid w:val="00E1406E"/>
+    <w:rPr>
+      <w:i/>
+      <w:iCs/>
+      <w:color w:val="404040" w:themeColor="text1" w:themeTint="BF"/>
+    </w:rPr>
+  </w:style>
+  <w:style w:type="character" w:customStyle="1" w:styleId="Ttulo3Car">
+    <w:name w:val="Título 3 Car"/>
+    <w:basedOn w:val="Fuentedeprrafopredeter"/>
+    <w:link w:val="Ttulo3"/>
+    <w:uiPriority w:val="9"/>
+    <w:semiHidden/>
+    <w:rsid w:val="00E1406E"/>
+    <w:rPr>
+      <w:rFonts w:eastAsiaTheme="majorEastAsia" w:cstheme="majorBidi"/>
+      <w:color w:val="365F91" w:themeColor="accent1" w:themeShade="BF"/>
+      <w:kern w:val="2"/>
+      <w:sz w:val="28"/>
+      <w:szCs w:val="28"/>
+      <w:lang w:val="es-AR"/>
+      <w14:ligatures w14:val="standardContextual"/>
+    </w:rPr>
   </w:style>
 </w:styles>
 </file>

</xml_diff>